<commit_message>
feat(app): add contact picker and harden signup networking
Enable emergency contact selection from phone contacts during onboarding, update mobile permissions, and improve API client resilience against transient host lookup failures while finalizing report formatting updates.

Made-with: Cursor
</commit_message>
<xml_diff>
--- a/docs/reports/SafeRide_Full_Project_Report.docx
+++ b/docs/reports/SafeRide_Full_Project_Report.docx
@@ -4,940 +4,1846 @@
   <w:body>
     <w:p>
       <w:pPr>
+        <w:spacing w:line="360" w:lineRule="auto"/>
+        <w:jc w:val="center"/>
+      </w:pPr>
+      <w:r>
+        <w:rPr>
+          <w:rFonts w:ascii="Times New Roman" w:hAnsi="Times New Roman" w:eastAsia="Times New Roman"/>
+          <w:b/>
+          <w:sz w:val="24"/>
+        </w:rPr>
+        <w:t>SafeRide School Transport System</w:t>
+      </w:r>
+    </w:p>
+    <w:p>
+      <w:pPr>
+        <w:spacing w:line="360" w:lineRule="auto"/>
+        <w:jc w:val="center"/>
+      </w:pPr>
+      <w:r>
+        <w:rPr>
+          <w:rFonts w:ascii="Times New Roman" w:hAnsi="Times New Roman" w:eastAsia="Times New Roman"/>
+          <w:sz w:val="24"/>
+        </w:rPr>
+        <w:t>Comprehensive Final Project Report</w:t>
+      </w:r>
+    </w:p>
+    <w:p>
+      <w:pPr>
+        <w:spacing w:line="360" w:lineRule="auto"/>
+        <w:jc w:val="center"/>
+      </w:pPr>
+      <w:r>
+        <w:rPr>
+          <w:rFonts w:ascii="Times New Roman" w:hAnsi="Times New Roman" w:eastAsia="Times New Roman"/>
+          <w:i/>
+          <w:sz w:val="24"/>
+        </w:rPr>
+        <w:t>Updated: April 14, 2026</w:t>
+      </w:r>
+    </w:p>
+    <w:p>
+      <w:pPr>
+        <w:spacing w:line="360" w:lineRule="auto"/>
+      </w:pPr>
+    </w:p>
+    <w:p>
+      <w:pPr>
+        <w:spacing w:line="360" w:lineRule="auto"/>
+        <w:jc w:val="center"/>
+      </w:pPr>
+      <w:r>
+        <w:rPr>
+          <w:rFonts w:ascii="Times New Roman" w:hAnsi="Times New Roman" w:eastAsia="Times New Roman"/>
+          <w:b/>
+          <w:sz w:val="24"/>
+        </w:rPr>
+        <w:t>Group Members</w:t>
+      </w:r>
+    </w:p>
+    <w:p>
+      <w:pPr>
+        <w:spacing w:line="360" w:lineRule="auto"/>
+        <w:jc w:val="center"/>
+      </w:pPr>
+      <w:r>
+        <w:rPr>
+          <w:rFonts w:ascii="Times New Roman" w:hAnsi="Times New Roman" w:eastAsia="Times New Roman"/>
+          <w:sz w:val="24"/>
+        </w:rPr>
+        <w:t>Alvin Yeboah</w:t>
+      </w:r>
+    </w:p>
+    <w:p>
+      <w:pPr>
+        <w:spacing w:line="360" w:lineRule="auto"/>
+        <w:jc w:val="center"/>
+      </w:pPr>
+      <w:r>
+        <w:rPr>
+          <w:rFonts w:ascii="Times New Roman" w:hAnsi="Times New Roman" w:eastAsia="Times New Roman"/>
+          <w:sz w:val="24"/>
+        </w:rPr>
+        <w:t>Jemima Arhin</w:t>
+      </w:r>
+    </w:p>
+    <w:p>
+      <w:pPr>
+        <w:spacing w:line="360" w:lineRule="auto"/>
+        <w:jc w:val="center"/>
+      </w:pPr>
+      <w:r>
+        <w:rPr>
+          <w:rFonts w:ascii="Times New Roman" w:hAnsi="Times New Roman" w:eastAsia="Times New Roman"/>
+          <w:sz w:val="24"/>
+        </w:rPr>
+        <w:t>Maame Yaa Badu Basoah</w:t>
+      </w:r>
+    </w:p>
+    <w:p>
+      <w:pPr>
+        <w:spacing w:line="360" w:lineRule="auto"/>
+        <w:jc w:val="center"/>
+      </w:pPr>
+      <w:r>
+        <w:rPr>
+          <w:rFonts w:ascii="Times New Roman" w:hAnsi="Times New Roman" w:eastAsia="Times New Roman"/>
+          <w:sz w:val="24"/>
+        </w:rPr>
+        <w:t>Nana Kofi Hayford</w:t>
+      </w:r>
+    </w:p>
+    <w:p>
+      <w:pPr>
+        <w:spacing w:line="360" w:lineRule="auto"/>
+        <w:jc w:val="center"/>
+      </w:pPr>
+      <w:r>
+        <w:rPr>
+          <w:rFonts w:ascii="Times New Roman" w:hAnsi="Times New Roman" w:eastAsia="Times New Roman"/>
+          <w:sz w:val="24"/>
+        </w:rPr>
+        <w:t>Akua Dede Amofa</w:t>
+      </w:r>
+    </w:p>
+    <w:p>
+      <w:pPr>
+        <w:spacing w:line="360" w:lineRule="auto"/>
+      </w:pPr>
+      <w:r>
+        <w:rPr>
+          <w:rFonts w:ascii="Times New Roman" w:hAnsi="Times New Roman" w:eastAsia="Times New Roman"/>
+          <w:sz w:val="24"/>
+        </w:rPr>
+        <w:br w:type="page"/>
+      </w:r>
+    </w:p>
+    <w:p>
+      <w:pPr>
         <w:pStyle w:val="Title"/>
+        <w:spacing w:line="360" w:lineRule="auto"/>
       </w:pPr>
       <w:r>
+        <w:rPr>
+          <w:rFonts w:ascii="Times New Roman" w:hAnsi="Times New Roman" w:eastAsia="Times New Roman"/>
+          <w:sz w:val="24"/>
+        </w:rPr>
         <w:t>SafeRide School</w:t>
       </w:r>
     </w:p>
     <w:p>
+      <w:pPr>
+        <w:spacing w:line="360" w:lineRule="auto"/>
+      </w:pPr>
       <w:r>
+        <w:rPr>
+          <w:rFonts w:ascii="Times New Roman" w:hAnsi="Times New Roman" w:eastAsia="Times New Roman"/>
+          <w:sz w:val="24"/>
+        </w:rPr>
         <w:t>Comprehensive End-to-End Project Report (Full Inclusive Edition)</w:t>
       </w:r>
     </w:p>
     <w:p>
+      <w:pPr>
+        <w:spacing w:line="360" w:lineRule="auto"/>
+      </w:pPr>
       <w:r>
+        <w:rPr>
+          <w:rFonts w:ascii="Times New Roman" w:hAnsi="Times New Roman" w:eastAsia="Times New Roman"/>
+          <w:sz w:val="24"/>
+        </w:rPr>
         <w:t>Date: 2026-04-14</w:t>
       </w:r>
     </w:p>
     <w:p>
+      <w:pPr>
+        <w:spacing w:line="360" w:lineRule="auto"/>
+      </w:pPr>
       <w:r>
+        <w:rPr>
+          <w:rFonts w:ascii="Times New Roman" w:hAnsi="Times New Roman" w:eastAsia="Times New Roman"/>
+          <w:sz w:val="24"/>
+        </w:rPr>
         <w:t>Prepared from repository implementation and provided source documents.</w:t>
       </w:r>
     </w:p>
     <w:p>
+      <w:pPr>
+        <w:spacing w:line="360" w:lineRule="auto"/>
+      </w:pPr>
       <w:r>
+        <w:rPr>
+          <w:rFonts w:ascii="Times New Roman" w:hAnsi="Times New Roman" w:eastAsia="Times New Roman"/>
+          <w:sz w:val="24"/>
+        </w:rPr>
         <w:br w:type="page"/>
       </w:r>
     </w:p>
     <w:p>
       <w:pPr>
         <w:pStyle w:val="Heading1"/>
+        <w:spacing w:line="360" w:lineRule="auto"/>
       </w:pPr>
       <w:r>
+        <w:rPr>
+          <w:rFonts w:ascii="Times New Roman" w:hAnsi="Times New Roman" w:eastAsia="Times New Roman"/>
+          <w:sz w:val="24"/>
+        </w:rPr>
         <w:t>Table of Contents</w:t>
       </w:r>
     </w:p>
     <w:p>
+      <w:pPr>
+        <w:spacing w:line="360" w:lineRule="auto"/>
+      </w:pPr>
       <w:r>
+        <w:rPr>
+          <w:rFonts w:ascii="Times New Roman" w:hAnsi="Times New Roman" w:eastAsia="Times New Roman"/>
+          <w:sz w:val="24"/>
+        </w:rPr>
         <w:t>1. Executive Summary</w:t>
       </w:r>
     </w:p>
     <w:p>
+      <w:pPr>
+        <w:spacing w:line="360" w:lineRule="auto"/>
+      </w:pPr>
       <w:r>
+        <w:rPr>
+          <w:rFonts w:ascii="Times New Roman" w:hAnsi="Times New Roman" w:eastAsia="Times New Roman"/>
+          <w:sz w:val="24"/>
+        </w:rPr>
         <w:t>2. Project Background and Problem Definition</w:t>
       </w:r>
     </w:p>
     <w:p>
+      <w:pPr>
+        <w:spacing w:line="360" w:lineRule="auto"/>
+      </w:pPr>
       <w:r>
+        <w:rPr>
+          <w:rFonts w:ascii="Times New Roman" w:hAnsi="Times New Roman" w:eastAsia="Times New Roman"/>
+          <w:sz w:val="24"/>
+        </w:rPr>
         <w:t>3. Vision, Scope, Stakeholders, and Success Criteria</w:t>
       </w:r>
     </w:p>
     <w:p>
+      <w:pPr>
+        <w:spacing w:line="360" w:lineRule="auto"/>
+      </w:pPr>
       <w:r>
+        <w:rPr>
+          <w:rFonts w:ascii="Times New Roman" w:hAnsi="Times New Roman" w:eastAsia="Times New Roman"/>
+          <w:sz w:val="24"/>
+        </w:rPr>
         <w:t>4. Requirements Analysis (Functional + Non-Functional)</w:t>
       </w:r>
     </w:p>
     <w:p>
+      <w:pPr>
+        <w:spacing w:line="360" w:lineRule="auto"/>
+      </w:pPr>
       <w:r>
+        <w:rPr>
+          <w:rFonts w:ascii="Times New Roman" w:hAnsi="Times New Roman" w:eastAsia="Times New Roman"/>
+          <w:sz w:val="24"/>
+        </w:rPr>
         <w:t>5. End-to-End User Flows and Operational Scenarios</w:t>
       </w:r>
     </w:p>
     <w:p>
+      <w:pPr>
+        <w:spacing w:line="360" w:lineRule="auto"/>
+      </w:pPr>
       <w:r>
+        <w:rPr>
+          <w:rFonts w:ascii="Times New Roman" w:hAnsi="Times New Roman" w:eastAsia="Times New Roman"/>
+          <w:sz w:val="24"/>
+        </w:rPr>
         <w:t>6. System Architecture Overview</w:t>
       </w:r>
     </w:p>
     <w:p>
+      <w:pPr>
+        <w:spacing w:line="360" w:lineRule="auto"/>
+      </w:pPr>
       <w:r>
+        <w:rPr>
+          <w:rFonts w:ascii="Times New Roman" w:hAnsi="Times New Roman" w:eastAsia="Times New Roman"/>
+          <w:sz w:val="24"/>
+        </w:rPr>
         <w:t>7. Backend Architecture and Implementation (NestJS)</w:t>
       </w:r>
     </w:p>
     <w:p>
+      <w:pPr>
+        <w:spacing w:line="360" w:lineRule="auto"/>
+      </w:pPr>
       <w:r>
+        <w:rPr>
+          <w:rFonts w:ascii="Times New Roman" w:hAnsi="Times New Roman" w:eastAsia="Times New Roman"/>
+          <w:sz w:val="24"/>
+        </w:rPr>
         <w:t>8. Mobile Architecture and Implementation (Flutter)</w:t>
       </w:r>
     </w:p>
     <w:p>
+      <w:pPr>
+        <w:spacing w:line="360" w:lineRule="auto"/>
+      </w:pPr>
       <w:r>
+        <w:rPr>
+          <w:rFonts w:ascii="Times New Roman" w:hAnsi="Times New Roman" w:eastAsia="Times New Roman"/>
+          <w:sz w:val="24"/>
+        </w:rPr>
         <w:t>9. API Surface and Contract Summary</w:t>
       </w:r>
     </w:p>
     <w:p>
+      <w:pPr>
+        <w:spacing w:line="360" w:lineRule="auto"/>
+      </w:pPr>
       <w:r>
+        <w:rPr>
+          <w:rFonts w:ascii="Times New Roman" w:hAnsi="Times New Roman" w:eastAsia="Times New Roman"/>
+          <w:sz w:val="24"/>
+        </w:rPr>
         <w:t>10. Database Design and Data Integrity</w:t>
       </w:r>
     </w:p>
     <w:p>
+      <w:pPr>
+        <w:spacing w:line="360" w:lineRule="auto"/>
+      </w:pPr>
       <w:r>
+        <w:rPr>
+          <w:rFonts w:ascii="Times New Roman" w:hAnsi="Times New Roman" w:eastAsia="Times New Roman"/>
+          <w:sz w:val="24"/>
+        </w:rPr>
         <w:t>11. Security, Validation, and Reliability Controls</w:t>
       </w:r>
     </w:p>
     <w:p>
+      <w:pPr>
+        <w:spacing w:line="360" w:lineRule="auto"/>
+      </w:pPr>
       <w:r>
+        <w:rPr>
+          <w:rFonts w:ascii="Times New Roman" w:hAnsi="Times New Roman" w:eastAsia="Times New Roman"/>
+          <w:sz w:val="24"/>
+        </w:rPr>
         <w:t>12. Realtime Tracking and Notification Strategy</w:t>
       </w:r>
     </w:p>
     <w:p>
+      <w:pPr>
+        <w:spacing w:line="360" w:lineRule="auto"/>
+      </w:pPr>
       <w:r>
+        <w:rPr>
+          <w:rFonts w:ascii="Times New Roman" w:hAnsi="Times New Roman" w:eastAsia="Times New Roman"/>
+          <w:sz w:val="24"/>
+        </w:rPr>
         <w:t>13. Testing, Quality, and Current Gaps</w:t>
       </w:r>
     </w:p>
     <w:p>
+      <w:pPr>
+        <w:spacing w:line="360" w:lineRule="auto"/>
+      </w:pPr>
       <w:r>
+        <w:rPr>
+          <w:rFonts w:ascii="Times New Roman" w:hAnsi="Times New Roman" w:eastAsia="Times New Roman"/>
+          <w:sz w:val="24"/>
+        </w:rPr>
         <w:t>14. Deployment and Operational Readiness</w:t>
       </w:r>
     </w:p>
     <w:p>
+      <w:pPr>
+        <w:spacing w:line="360" w:lineRule="auto"/>
+      </w:pPr>
       <w:r>
+        <w:rPr>
+          <w:rFonts w:ascii="Times New Roman" w:hAnsi="Times New Roman" w:eastAsia="Times New Roman"/>
+          <w:sz w:val="24"/>
+        </w:rPr>
         <w:t>15. Risks, Limitations, and Improvement Roadmap</w:t>
       </w:r>
     </w:p>
     <w:p>
+      <w:pPr>
+        <w:spacing w:line="360" w:lineRule="auto"/>
+      </w:pPr>
       <w:r>
+        <w:rPr>
+          <w:rFonts w:ascii="Times New Roman" w:hAnsi="Times New Roman" w:eastAsia="Times New Roman"/>
+          <w:sz w:val="24"/>
+        </w:rPr>
         <w:t>16. Conclusion</w:t>
       </w:r>
     </w:p>
     <w:p>
+      <w:pPr>
+        <w:spacing w:line="360" w:lineRule="auto"/>
+      </w:pPr>
       <w:r>
+        <w:rPr>
+          <w:rFonts w:ascii="Times New Roman" w:hAnsi="Times New Roman" w:eastAsia="Times New Roman"/>
+          <w:sz w:val="24"/>
+        </w:rPr>
         <w:t>Appendix A: Full Source Diagram Pages (Embedded)</w:t>
       </w:r>
     </w:p>
     <w:p>
+      <w:pPr>
+        <w:spacing w:line="360" w:lineRule="auto"/>
+      </w:pPr>
       <w:r>
+        <w:rPr>
+          <w:rFonts w:ascii="Times New Roman" w:hAnsi="Times New Roman" w:eastAsia="Times New Roman"/>
+          <w:sz w:val="24"/>
+        </w:rPr>
         <w:t>Appendix B: Endpoint Catalogue by Domain</w:t>
       </w:r>
     </w:p>
     <w:p>
+      <w:pPr>
+        <w:spacing w:line="360" w:lineRule="auto"/>
+      </w:pPr>
       <w:r>
+        <w:rPr>
+          <w:rFonts w:ascii="Times New Roman" w:hAnsi="Times New Roman" w:eastAsia="Times New Roman"/>
+          <w:sz w:val="24"/>
+        </w:rPr>
         <w:t>Appendix C: Data Dictionary</w:t>
       </w:r>
     </w:p>
     <w:p>
+      <w:pPr>
+        <w:spacing w:line="360" w:lineRule="auto"/>
+      </w:pPr>
       <w:r>
+        <w:rPr>
+          <w:rFonts w:ascii="Times New Roman" w:hAnsi="Times New Roman" w:eastAsia="Times New Roman"/>
+          <w:sz w:val="24"/>
+        </w:rPr>
         <w:br w:type="page"/>
       </w:r>
     </w:p>
     <w:p>
       <w:pPr>
         <w:pStyle w:val="Heading1"/>
+        <w:spacing w:line="360" w:lineRule="auto"/>
       </w:pPr>
       <w:r>
+        <w:rPr>
+          <w:rFonts w:ascii="Times New Roman" w:hAnsi="Times New Roman" w:eastAsia="Times New Roman"/>
+          <w:sz w:val="24"/>
+        </w:rPr>
         <w:t>1. Executive Summary</w:t>
       </w:r>
     </w:p>
     <w:p>
+      <w:pPr>
+        <w:spacing w:line="360" w:lineRule="auto"/>
+      </w:pPr>
       <w:r>
+        <w:rPr>
+          <w:rFonts w:ascii="Times New Roman" w:hAnsi="Times New Roman" w:eastAsia="Times New Roman"/>
+          <w:sz w:val="24"/>
+        </w:rPr>
         <w:t>SafeRide School is a role-driven school transport platform designed to improve safety, accountability, and communication across parents, drivers, and school administrators. The solution is implemented as a Flutter mobile application backed by a NestJS service with PostgreSQL data persistence via Prisma ORM.</w:t>
       </w:r>
     </w:p>
     <w:p>
+      <w:pPr>
+        <w:spacing w:line="360" w:lineRule="auto"/>
+      </w:pPr>
       <w:r>
+        <w:rPr>
+          <w:rFonts w:ascii="Times New Roman" w:hAnsi="Times New Roman" w:eastAsia="Times New Roman"/>
+          <w:sz w:val="24"/>
+        </w:rPr>
         <w:t>The platform currently delivers the core lifecycle of school transport operations: authentication, role-based dashboards, trip lifecycle management, attendance capture, notifications, and administrative data workflows including CSV onboarding of students. The implementation is functionally meaningful and beyond prototype-only UI stubs, but still contains areas requiring hardening for enterprise-scale production.</w:t>
       </w:r>
     </w:p>
     <w:p>
       <w:pPr>
         <w:pStyle w:val="Heading1"/>
+        <w:spacing w:line="360" w:lineRule="auto"/>
       </w:pPr>
       <w:r>
+        <w:rPr>
+          <w:rFonts w:ascii="Times New Roman" w:hAnsi="Times New Roman" w:eastAsia="Times New Roman"/>
+          <w:sz w:val="24"/>
+        </w:rPr>
         <w:t>2. Project Background and Problem Definition</w:t>
       </w:r>
     </w:p>
     <w:p>
+      <w:pPr>
+        <w:spacing w:line="360" w:lineRule="auto"/>
+      </w:pPr>
       <w:r>
+        <w:rPr>
+          <w:rFonts w:ascii="Times New Roman" w:hAnsi="Times New Roman" w:eastAsia="Times New Roman"/>
+          <w:sz w:val="24"/>
+        </w:rPr>
         <w:t>School transport operations are often fragmented across phone calls, paper attendance, informal WhatsApp updates, and delayed issue escalation. This creates uncertainty for parents, operational burden for schools, and weak auditability for incidents.</w:t>
       </w:r>
     </w:p>
     <w:p>
+      <w:pPr>
+        <w:spacing w:line="360" w:lineRule="auto"/>
+      </w:pPr>
       <w:r>
+        <w:rPr>
+          <w:rFonts w:ascii="Times New Roman" w:hAnsi="Times New Roman" w:eastAsia="Times New Roman"/>
+          <w:sz w:val="24"/>
+        </w:rPr>
         <w:t>SafeRide addresses this by centralizing transport state into a single digital system with role-specific access and controlled data visibility. The product goals include real-time situational awareness, trip accountability, and workflow consistency.</w:t>
       </w:r>
     </w:p>
     <w:p>
       <w:pPr>
         <w:pStyle w:val="Heading1"/>
+        <w:spacing w:line="360" w:lineRule="auto"/>
       </w:pPr>
       <w:r>
+        <w:rPr>
+          <w:rFonts w:ascii="Times New Roman" w:hAnsi="Times New Roman" w:eastAsia="Times New Roman"/>
+          <w:sz w:val="24"/>
+        </w:rPr>
         <w:t>3. Vision, Scope, Stakeholders, and Success Criteria</w:t>
       </w:r>
     </w:p>
     <w:p>
       <w:pPr>
         <w:pStyle w:val="Heading2"/>
+        <w:spacing w:line="360" w:lineRule="auto"/>
       </w:pPr>
       <w:r>
+        <w:rPr>
+          <w:rFonts w:ascii="Times New Roman" w:hAnsi="Times New Roman" w:eastAsia="Times New Roman"/>
+          <w:sz w:val="24"/>
+        </w:rPr>
         <w:t>3.1 Product Vision</w:t>
       </w:r>
     </w:p>
     <w:p>
+      <w:pPr>
+        <w:spacing w:line="360" w:lineRule="auto"/>
+      </w:pPr>
       <w:r>
+        <w:rPr>
+          <w:rFonts w:ascii="Times New Roman" w:hAnsi="Times New Roman" w:eastAsia="Times New Roman"/>
+          <w:sz w:val="24"/>
+        </w:rPr>
         <w:t>Provide confidence that every student journey is visible, trackable, and auditable while preserving data security and role-based restrictions.</w:t>
       </w:r>
     </w:p>
     <w:p>
       <w:pPr>
         <w:pStyle w:val="Heading2"/>
+        <w:spacing w:line="360" w:lineRule="auto"/>
       </w:pPr>
       <w:r>
+        <w:rPr>
+          <w:rFonts w:ascii="Times New Roman" w:hAnsi="Times New Roman" w:eastAsia="Times New Roman"/>
+          <w:sz w:val="24"/>
+        </w:rPr>
         <w:t>3.2 Stakeholders</w:t>
       </w:r>
     </w:p>
     <w:p>
       <w:pPr>
         <w:pStyle w:val="ListBullet"/>
+        <w:spacing w:line="360" w:lineRule="auto"/>
       </w:pPr>
       <w:r>
+        <w:rPr>
+          <w:rFonts w:ascii="Times New Roman" w:hAnsi="Times New Roman" w:eastAsia="Times New Roman"/>
+          <w:sz w:val="24"/>
+        </w:rPr>
         <w:t>Parents: need timely transport status and alerts for assigned children.</w:t>
       </w:r>
     </w:p>
     <w:p>
       <w:pPr>
         <w:pStyle w:val="ListBullet"/>
+        <w:spacing w:line="360" w:lineRule="auto"/>
       </w:pPr>
       <w:r>
+        <w:rPr>
+          <w:rFonts w:ascii="Times New Roman" w:hAnsi="Times New Roman" w:eastAsia="Times New Roman"/>
+          <w:sz w:val="24"/>
+        </w:rPr>
         <w:t>Drivers: need low-friction tools for trip execution and student attendance actions.</w:t>
       </w:r>
     </w:p>
     <w:p>
       <w:pPr>
         <w:pStyle w:val="ListBullet"/>
+        <w:spacing w:line="360" w:lineRule="auto"/>
       </w:pPr>
       <w:r>
+        <w:rPr>
+          <w:rFonts w:ascii="Times New Roman" w:hAnsi="Times New Roman" w:eastAsia="Times New Roman"/>
+          <w:sz w:val="24"/>
+        </w:rPr>
         <w:t>School admins: need operational controls, monitoring, and reporting.</w:t>
       </w:r>
     </w:p>
     <w:p>
       <w:pPr>
         <w:pStyle w:val="ListBullet"/>
+        <w:spacing w:line="360" w:lineRule="auto"/>
       </w:pPr>
       <w:r>
+        <w:rPr>
+          <w:rFonts w:ascii="Times New Roman" w:hAnsi="Times New Roman" w:eastAsia="Times New Roman"/>
+          <w:sz w:val="24"/>
+        </w:rPr>
         <w:t>School management: needs compliance evidence and incident traceability.</w:t>
       </w:r>
     </w:p>
     <w:p>
       <w:pPr>
         <w:pStyle w:val="Heading2"/>
+        <w:spacing w:line="360" w:lineRule="auto"/>
       </w:pPr>
       <w:r>
+        <w:rPr>
+          <w:rFonts w:ascii="Times New Roman" w:hAnsi="Times New Roman" w:eastAsia="Times New Roman"/>
+          <w:sz w:val="24"/>
+        </w:rPr>
         <w:t>3.3 Scope</w:t>
       </w:r>
     </w:p>
     <w:p>
       <w:pPr>
         <w:pStyle w:val="ListBullet"/>
+        <w:spacing w:line="360" w:lineRule="auto"/>
       </w:pPr>
       <w:r>
+        <w:rPr>
+          <w:rFonts w:ascii="Times New Roman" w:hAnsi="Times New Roman" w:eastAsia="Times New Roman"/>
+          <w:sz w:val="24"/>
+        </w:rPr>
         <w:t>In-scope: mobile role dashboards, route/trip operations, attendance, notifications, CSV student import, role-based APIs.</w:t>
       </w:r>
     </w:p>
     <w:p>
       <w:pPr>
         <w:pStyle w:val="ListBullet"/>
+        <w:spacing w:line="360" w:lineRule="auto"/>
       </w:pPr>
       <w:r>
+        <w:rPr>
+          <w:rFonts w:ascii="Times New Roman" w:hAnsi="Times New Roman" w:eastAsia="Times New Roman"/>
+          <w:sz w:val="24"/>
+        </w:rPr>
         <w:t>In-scope: backend REST + websocket support, relational data model, session auth, guard-based authorization.</w:t>
       </w:r>
     </w:p>
     <w:p>
       <w:pPr>
         <w:pStyle w:val="ListBullet"/>
+        <w:spacing w:line="360" w:lineRule="auto"/>
       </w:pPr>
       <w:r>
+        <w:rPr>
+          <w:rFonts w:ascii="Times New Roman" w:hAnsi="Times New Roman" w:eastAsia="Times New Roman"/>
+          <w:sz w:val="24"/>
+        </w:rPr>
         <w:t>Out-of-scope (current stage): fully mature incident escalation pipeline, complete map telemetry for all role views, enterprise SSO, and complete test automation coverage.</w:t>
       </w:r>
     </w:p>
     <w:p>
       <w:pPr>
         <w:pStyle w:val="Heading1"/>
+        <w:spacing w:line="360" w:lineRule="auto"/>
       </w:pPr>
       <w:r>
+        <w:rPr>
+          <w:rFonts w:ascii="Times New Roman" w:hAnsi="Times New Roman" w:eastAsia="Times New Roman"/>
+          <w:sz w:val="24"/>
+        </w:rPr>
         <w:t>4. Requirements Analysis (Functional + Non-Functional)</w:t>
       </w:r>
     </w:p>
     <w:p>
       <w:pPr>
         <w:pStyle w:val="Heading2"/>
+        <w:spacing w:line="360" w:lineRule="auto"/>
       </w:pPr>
       <w:r>
+        <w:rPr>
+          <w:rFonts w:ascii="Times New Roman" w:hAnsi="Times New Roman" w:eastAsia="Times New Roman"/>
+          <w:sz w:val="24"/>
+        </w:rPr>
         <w:t>4.1 Functional Requirements Coverage</w:t>
       </w:r>
     </w:p>
     <w:p>
       <w:pPr>
         <w:pStyle w:val="ListBullet"/>
+        <w:spacing w:line="360" w:lineRule="auto"/>
       </w:pPr>
       <w:r>
+        <w:rPr>
+          <w:rFonts w:ascii="Times New Roman" w:hAnsi="Times New Roman" w:eastAsia="Times New Roman"/>
+          <w:sz w:val="24"/>
+        </w:rPr>
         <w:t>Secure login and session-backed access for all roles.</w:t>
       </w:r>
     </w:p>
     <w:p>
       <w:pPr>
         <w:pStyle w:val="ListBullet"/>
+        <w:spacing w:line="360" w:lineRule="auto"/>
       </w:pPr>
       <w:r>
+        <w:rPr>
+          <w:rFonts w:ascii="Times New Roman" w:hAnsi="Times New Roman" w:eastAsia="Times New Roman"/>
+          <w:sz w:val="24"/>
+        </w:rPr>
         <w:t>Role-specific dashboard rendering and data visibility boundaries.</w:t>
       </w:r>
     </w:p>
     <w:p>
       <w:pPr>
         <w:pStyle w:val="ListBullet"/>
+        <w:spacing w:line="360" w:lineRule="auto"/>
       </w:pPr>
       <w:r>
+        <w:rPr>
+          <w:rFonts w:ascii="Times New Roman" w:hAnsi="Times New Roman" w:eastAsia="Times New Roman"/>
+          <w:sz w:val="24"/>
+        </w:rPr>
         <w:t>Driver trip start/end controls and progress updates.</w:t>
       </w:r>
     </w:p>
     <w:p>
       <w:pPr>
         <w:pStyle w:val="ListBullet"/>
+        <w:spacing w:line="360" w:lineRule="auto"/>
       </w:pPr>
       <w:r>
+        <w:rPr>
+          <w:rFonts w:ascii="Times New Roman" w:hAnsi="Times New Roman" w:eastAsia="Times New Roman"/>
+          <w:sz w:val="24"/>
+        </w:rPr>
         <w:t>Student attendance marking per trip with idempotent write behavior.</w:t>
       </w:r>
     </w:p>
     <w:p>
       <w:pPr>
         <w:pStyle w:val="ListBullet"/>
+        <w:spacing w:line="360" w:lineRule="auto"/>
       </w:pPr>
       <w:r>
+        <w:rPr>
+          <w:rFonts w:ascii="Times New Roman" w:hAnsi="Times New Roman" w:eastAsia="Times New Roman"/>
+          <w:sz w:val="24"/>
+        </w:rPr>
         <w:t>Parent-facing tracking and notification awareness flows.</w:t>
       </w:r>
     </w:p>
     <w:p>
       <w:pPr>
         <w:pStyle w:val="ListBullet"/>
+        <w:spacing w:line="360" w:lineRule="auto"/>
       </w:pPr>
       <w:r>
+        <w:rPr>
+          <w:rFonts w:ascii="Times New Roman" w:hAnsi="Times New Roman" w:eastAsia="Times New Roman"/>
+          <w:sz w:val="24"/>
+        </w:rPr>
         <w:t>Admin operations for students, buses, trips, and CSV onboarding.</w:t>
       </w:r>
     </w:p>
     <w:p>
       <w:pPr>
         <w:pStyle w:val="ListBullet"/>
+        <w:spacing w:line="360" w:lineRule="auto"/>
       </w:pPr>
       <w:r>
+        <w:rPr>
+          <w:rFonts w:ascii="Times New Roman" w:hAnsi="Times New Roman" w:eastAsia="Times New Roman"/>
+          <w:sz w:val="24"/>
+        </w:rPr>
         <w:t>Notification listing, unread count tracking, and read-state updates.</w:t>
       </w:r>
     </w:p>
     <w:p>
       <w:pPr>
         <w:pStyle w:val="Heading2"/>
+        <w:spacing w:line="360" w:lineRule="auto"/>
       </w:pPr>
       <w:r>
+        <w:rPr>
+          <w:rFonts w:ascii="Times New Roman" w:hAnsi="Times New Roman" w:eastAsia="Times New Roman"/>
+          <w:sz w:val="24"/>
+        </w:rPr>
         <w:t>4.2 Non-Functional Requirements</w:t>
       </w:r>
     </w:p>
     <w:p>
       <w:pPr>
         <w:pStyle w:val="ListBullet"/>
+        <w:spacing w:line="360" w:lineRule="auto"/>
       </w:pPr>
       <w:r>
+        <w:rPr>
+          <w:rFonts w:ascii="Times New Roman" w:hAnsi="Times New Roman" w:eastAsia="Times New Roman"/>
+          <w:sz w:val="24"/>
+        </w:rPr>
         <w:t>Security: authenticated routes, role checks, server-side validation, password hashing.</w:t>
       </w:r>
     </w:p>
     <w:p>
       <w:pPr>
         <w:pStyle w:val="ListBullet"/>
+        <w:spacing w:line="360" w:lineRule="auto"/>
       </w:pPr>
       <w:r>
+        <w:rPr>
+          <w:rFonts w:ascii="Times New Roman" w:hAnsi="Times New Roman" w:eastAsia="Times New Roman"/>
+          <w:sz w:val="24"/>
+        </w:rPr>
         <w:t>Maintainability: modular NestJS domains + provider/service/model layering in Flutter.</w:t>
       </w:r>
     </w:p>
     <w:p>
       <w:pPr>
         <w:pStyle w:val="ListBullet"/>
+        <w:spacing w:line="360" w:lineRule="auto"/>
       </w:pPr>
       <w:r>
+        <w:rPr>
+          <w:rFonts w:ascii="Times New Roman" w:hAnsi="Times New Roman" w:eastAsia="Times New Roman"/>
+          <w:sz w:val="24"/>
+        </w:rPr>
         <w:t>Reliability: structured exception handling and request validation guards.</w:t>
       </w:r>
     </w:p>
     <w:p>
       <w:pPr>
         <w:pStyle w:val="ListBullet"/>
+        <w:spacing w:line="360" w:lineRule="auto"/>
       </w:pPr>
       <w:r>
+        <w:rPr>
+          <w:rFonts w:ascii="Times New Roman" w:hAnsi="Times New Roman" w:eastAsia="Times New Roman"/>
+          <w:sz w:val="24"/>
+        </w:rPr>
         <w:t>Scalability baseline: modular API and relational model ready for extension.</w:t>
       </w:r>
     </w:p>
     <w:p>
       <w:pPr>
         <w:pStyle w:val="Heading1"/>
+        <w:spacing w:line="360" w:lineRule="auto"/>
       </w:pPr>
       <w:r>
+        <w:rPr>
+          <w:rFonts w:ascii="Times New Roman" w:hAnsi="Times New Roman" w:eastAsia="Times New Roman"/>
+          <w:sz w:val="24"/>
+        </w:rPr>
         <w:t>5. End-to-End User Flows and Operational Scenarios</w:t>
       </w:r>
     </w:p>
     <w:p>
       <w:pPr>
         <w:pStyle w:val="Heading2"/>
+        <w:spacing w:line="360" w:lineRule="auto"/>
       </w:pPr>
       <w:r>
+        <w:rPr>
+          <w:rFonts w:ascii="Times New Roman" w:hAnsi="Times New Roman" w:eastAsia="Times New Roman"/>
+          <w:sz w:val="24"/>
+        </w:rPr>
         <w:t>5.1 Parent Journey</w:t>
       </w:r>
     </w:p>
     <w:p>
+      <w:pPr>
+        <w:spacing w:line="360" w:lineRule="auto"/>
+      </w:pPr>
       <w:r>
+        <w:rPr>
+          <w:rFonts w:ascii="Times New Roman" w:hAnsi="Times New Roman" w:eastAsia="Times New Roman"/>
+          <w:sz w:val="24"/>
+        </w:rPr>
         <w:t>Parent users authenticate, access a role-routed dashboard, inspect child-level trip context, review notifications, and open live map tracking for trip movement context.</w:t>
       </w:r>
     </w:p>
     <w:p>
       <w:pPr>
         <w:pStyle w:val="Heading2"/>
+        <w:spacing w:line="360" w:lineRule="auto"/>
       </w:pPr>
       <w:r>
+        <w:rPr>
+          <w:rFonts w:ascii="Times New Roman" w:hAnsi="Times New Roman" w:eastAsia="Times New Roman"/>
+          <w:sz w:val="24"/>
+        </w:rPr>
         <w:t>5.2 Driver Journey</w:t>
       </w:r>
     </w:p>
     <w:p>
+      <w:pPr>
+        <w:spacing w:line="360" w:lineRule="auto"/>
+      </w:pPr>
       <w:r>
+        <w:rPr>
+          <w:rFonts w:ascii="Times New Roman" w:hAnsi="Times New Roman" w:eastAsia="Times New Roman"/>
+          <w:sz w:val="24"/>
+        </w:rPr>
         <w:t>Driver users authenticate, start assigned trips, report attendance status for students, and maintain active trip operations until completion. During active trip state, location reporting attempts run periodically.</w:t>
       </w:r>
     </w:p>
     <w:p>
       <w:pPr>
         <w:pStyle w:val="Heading2"/>
+        <w:spacing w:line="360" w:lineRule="auto"/>
       </w:pPr>
       <w:r>
+        <w:rPr>
+          <w:rFonts w:ascii="Times New Roman" w:hAnsi="Times New Roman" w:eastAsia="Times New Roman"/>
+          <w:sz w:val="24"/>
+        </w:rPr>
         <w:t>5.3 Admin Journey</w:t>
       </w:r>
     </w:p>
     <w:p>
+      <w:pPr>
+        <w:spacing w:line="360" w:lineRule="auto"/>
+      </w:pPr>
       <w:r>
+        <w:rPr>
+          <w:rFonts w:ascii="Times New Roman" w:hAnsi="Times New Roman" w:eastAsia="Times New Roman"/>
+          <w:sz w:val="24"/>
+        </w:rPr>
         <w:t>Admin users maintain operational entities (students, buses, trips), monitor dashboards, review recent events, inspect fleet-level map views, and bulk import student records via CSV preview+commit workflow.</w:t>
       </w:r>
     </w:p>
     <w:p>
       <w:pPr>
         <w:pStyle w:val="Heading1"/>
+        <w:spacing w:line="360" w:lineRule="auto"/>
       </w:pPr>
       <w:r>
+        <w:rPr>
+          <w:rFonts w:ascii="Times New Roman" w:hAnsi="Times New Roman" w:eastAsia="Times New Roman"/>
+          <w:sz w:val="24"/>
+        </w:rPr>
         <w:t>6. System Architecture Overview</w:t>
       </w:r>
     </w:p>
     <w:p>
+      <w:pPr>
+        <w:spacing w:line="360" w:lineRule="auto"/>
+      </w:pPr>
       <w:r>
+        <w:rPr>
+          <w:rFonts w:ascii="Times New Roman" w:hAnsi="Times New Roman" w:eastAsia="Times New Roman"/>
+          <w:sz w:val="24"/>
+        </w:rPr>
         <w:t>Architecture follows a client-server model with clearly separated concerns: Flutter mobile app for presentation and interaction, NestJS backend for business logic and policy enforcement, and PostgreSQL for durable relational data.</w:t>
       </w:r>
     </w:p>
     <w:p>
       <w:pPr>
         <w:pStyle w:val="ListBullet"/>
+        <w:spacing w:line="360" w:lineRule="auto"/>
       </w:pPr>
       <w:r>
+        <w:rPr>
+          <w:rFonts w:ascii="Times New Roman" w:hAnsi="Times New Roman" w:eastAsia="Times New Roman"/>
+          <w:sz w:val="24"/>
+        </w:rPr>
         <w:t>Mobile: UI + provider state + service contracts + API client.</w:t>
       </w:r>
     </w:p>
     <w:p>
       <w:pPr>
         <w:pStyle w:val="ListBullet"/>
+        <w:spacing w:line="360" w:lineRule="auto"/>
       </w:pPr>
       <w:r>
+        <w:rPr>
+          <w:rFonts w:ascii="Times New Roman" w:hAnsi="Times New Roman" w:eastAsia="Times New Roman"/>
+          <w:sz w:val="24"/>
+        </w:rPr>
         <w:t>Backend: modular controllers/services + guards + validation + persistence + sockets.</w:t>
       </w:r>
     </w:p>
     <w:p>
       <w:pPr>
         <w:pStyle w:val="ListBullet"/>
+        <w:spacing w:line="360" w:lineRule="auto"/>
       </w:pPr>
       <w:r>
+        <w:rPr>
+          <w:rFonts w:ascii="Times New Roman" w:hAnsi="Times New Roman" w:eastAsia="Times New Roman"/>
+          <w:sz w:val="24"/>
+        </w:rPr>
         <w:t>Data: normalized relational entities with key uniqueness and relationship constraints.</w:t>
       </w:r>
     </w:p>
     <w:p>
       <w:pPr>
         <w:pStyle w:val="Heading1"/>
+        <w:spacing w:line="360" w:lineRule="auto"/>
       </w:pPr>
       <w:r>
+        <w:rPr>
+          <w:rFonts w:ascii="Times New Roman" w:hAnsi="Times New Roman" w:eastAsia="Times New Roman"/>
+          <w:sz w:val="24"/>
+        </w:rPr>
         <w:t>7. Backend Architecture and Implementation (NestJS)</w:t>
       </w:r>
     </w:p>
     <w:p>
       <w:pPr>
         <w:pStyle w:val="Heading2"/>
+        <w:spacing w:line="360" w:lineRule="auto"/>
       </w:pPr>
       <w:r>
+        <w:rPr>
+          <w:rFonts w:ascii="Times New Roman" w:hAnsi="Times New Roman" w:eastAsia="Times New Roman"/>
+          <w:sz w:val="24"/>
+        </w:rPr>
         <w:t>7.1 Bootstrapping Pipeline</w:t>
       </w:r>
     </w:p>
     <w:p>
       <w:pPr>
         <w:pStyle w:val="ListBullet"/>
+        <w:spacing w:line="360" w:lineRule="auto"/>
       </w:pPr>
       <w:r>
+        <w:rPr>
+          <w:rFonts w:ascii="Times New Roman" w:hAnsi="Times New Roman" w:eastAsia="Times New Roman"/>
+          <w:sz w:val="24"/>
+        </w:rPr>
         <w:t>Nest app initialization with global /api prefix.</w:t>
       </w:r>
     </w:p>
     <w:p>
       <w:pPr>
         <w:pStyle w:val="ListBullet"/>
+        <w:spacing w:line="360" w:lineRule="auto"/>
       </w:pPr>
       <w:r>
+        <w:rPr>
+          <w:rFonts w:ascii="Times New Roman" w:hAnsi="Times New Roman" w:eastAsia="Times New Roman"/>
+          <w:sz w:val="24"/>
+        </w:rPr>
         <w:t>Socket.IO adapter registration for realtime gateway support.</w:t>
       </w:r>
     </w:p>
     <w:p>
       <w:pPr>
         <w:pStyle w:val="ListBullet"/>
+        <w:spacing w:line="360" w:lineRule="auto"/>
       </w:pPr>
       <w:r>
+        <w:rPr>
+          <w:rFonts w:ascii="Times New Roman" w:hAnsi="Times New Roman" w:eastAsia="Times New Roman"/>
+          <w:sz w:val="24"/>
+        </w:rPr>
         <w:t>Global ValidationPipe with whitelist + transform + forbidden unknown properties.</w:t>
       </w:r>
     </w:p>
     <w:p>
       <w:pPr>
         <w:pStyle w:val="ListBullet"/>
+        <w:spacing w:line="360" w:lineRule="auto"/>
       </w:pPr>
       <w:r>
+        <w:rPr>
+          <w:rFonts w:ascii="Times New Roman" w:hAnsi="Times New Roman" w:eastAsia="Times New Roman"/>
+          <w:sz w:val="24"/>
+        </w:rPr>
         <w:t>Global exception filter for standardized error response envelope.</w:t>
       </w:r>
     </w:p>
     <w:p>
       <w:pPr>
         <w:pStyle w:val="ListBullet"/>
+        <w:spacing w:line="360" w:lineRule="auto"/>
       </w:pPr>
       <w:r>
+        <w:rPr>
+          <w:rFonts w:ascii="Times New Roman" w:hAnsi="Times New Roman" w:eastAsia="Times New Roman"/>
+          <w:sz w:val="24"/>
+        </w:rPr>
         <w:t>Environment-driven CORS policy and optional OpenAPI docs in non-production.</w:t>
       </w:r>
     </w:p>
     <w:p>
       <w:pPr>
         <w:pStyle w:val="Heading2"/>
+        <w:spacing w:line="360" w:lineRule="auto"/>
       </w:pPr>
       <w:r>
+        <w:rPr>
+          <w:rFonts w:ascii="Times New Roman" w:hAnsi="Times New Roman" w:eastAsia="Times New Roman"/>
+          <w:sz w:val="24"/>
+        </w:rPr>
         <w:t>7.2 Domain Modules</w:t>
       </w:r>
     </w:p>
     <w:p>
+      <w:pPr>
+        <w:spacing w:line="360" w:lineRule="auto"/>
+      </w:pPr>
       <w:r>
+        <w:rPr>
+          <w:rFonts w:ascii="Times New Roman" w:hAnsi="Times New Roman" w:eastAsia="Times New Roman"/>
+          <w:sz w:val="24"/>
+        </w:rPr>
         <w:t>The backend is decomposed into auth, users, parents, students, buses, trips, attendance, notifications, dashboard, routes, csv-import, database, and common modules. This structure limits coupling and supports feature evolution by domain ownership.</w:t>
       </w:r>
     </w:p>
     <w:p>
       <w:pPr>
         <w:pStyle w:val="Heading2"/>
+        <w:spacing w:line="360" w:lineRule="auto"/>
       </w:pPr>
       <w:r>
+        <w:rPr>
+          <w:rFonts w:ascii="Times New Roman" w:hAnsi="Times New Roman" w:eastAsia="Times New Roman"/>
+          <w:sz w:val="24"/>
+        </w:rPr>
         <w:t>7.3 Authentication + Authorization</w:t>
       </w:r>
     </w:p>
     <w:p>
+      <w:pPr>
+        <w:spacing w:line="360" w:lineRule="auto"/>
+      </w:pPr>
       <w:r>
+        <w:rPr>
+          <w:rFonts w:ascii="Times New Roman" w:hAnsi="Times New Roman" w:eastAsia="Times New Roman"/>
+          <w:sz w:val="24"/>
+        </w:rPr>
         <w:t>Authentication is session-token based with server-side token persistence. Bearer tokens are verified against Session records with expiry checks. Authorization is role-driven via decorators and global guards, ensuring route-level access boundaries.</w:t>
       </w:r>
     </w:p>
     <w:p>
       <w:pPr>
         <w:pStyle w:val="Heading2"/>
+        <w:spacing w:line="360" w:lineRule="auto"/>
       </w:pPr>
       <w:r>
+        <w:rPr>
+          <w:rFonts w:ascii="Times New Roman" w:hAnsi="Times New Roman" w:eastAsia="Times New Roman"/>
+          <w:sz w:val="24"/>
+        </w:rPr>
         <w:t>7.4 Business Flows</w:t>
       </w:r>
     </w:p>
     <w:p>
       <w:pPr>
         <w:pStyle w:val="ListBullet"/>
+        <w:spacing w:line="360" w:lineRule="auto"/>
       </w:pPr>
       <w:r>
+        <w:rPr>
+          <w:rFonts w:ascii="Times New Roman" w:hAnsi="Times New Roman" w:eastAsia="Times New Roman"/>
+          <w:sz w:val="24"/>
+        </w:rPr>
         <w:t>Trip lifecycle: scheduled -&gt; in progress -&gt; completed with controlled transitions.</w:t>
       </w:r>
     </w:p>
     <w:p>
       <w:pPr>
         <w:pStyle w:val="ListBullet"/>
+        <w:spacing w:line="360" w:lineRule="auto"/>
       </w:pPr>
       <w:r>
+        <w:rPr>
+          <w:rFonts w:ascii="Times New Roman" w:hAnsi="Times New Roman" w:eastAsia="Times New Roman"/>
+          <w:sz w:val="24"/>
+        </w:rPr>
         <w:t>Attendance: student+trip upsert semantics preventing duplicates.</w:t>
       </w:r>
     </w:p>
     <w:p>
       <w:pPr>
         <w:pStyle w:val="ListBullet"/>
+        <w:spacing w:line="360" w:lineRule="auto"/>
       </w:pPr>
       <w:r>
+        <w:rPr>
+          <w:rFonts w:ascii="Times New Roman" w:hAnsi="Times New Roman" w:eastAsia="Times New Roman"/>
+          <w:sz w:val="24"/>
+        </w:rPr>
         <w:t>CSV import: parse/normalize/validate/preview/commit with duplicate skipping.</w:t>
       </w:r>
     </w:p>
     <w:p>
       <w:pPr>
         <w:pStyle w:val="ListBullet"/>
+        <w:spacing w:line="360" w:lineRule="auto"/>
       </w:pPr>
       <w:r>
+        <w:rPr>
+          <w:rFonts w:ascii="Times New Roman" w:hAnsi="Times New Roman" w:eastAsia="Times New Roman"/>
+          <w:sz w:val="24"/>
+        </w:rPr>
         <w:t>Notifications: role and student-targeted retrieval with unread count support.</w:t>
       </w:r>
     </w:p>
     <w:p>
       <w:pPr>
         <w:pStyle w:val="Heading1"/>
+        <w:spacing w:line="360" w:lineRule="auto"/>
       </w:pPr>
       <w:r>
+        <w:rPr>
+          <w:rFonts w:ascii="Times New Roman" w:hAnsi="Times New Roman" w:eastAsia="Times New Roman"/>
+          <w:sz w:val="24"/>
+        </w:rPr>
         <w:t>8. Mobile Architecture and Implementation (Flutter)</w:t>
       </w:r>
     </w:p>
     <w:p>
       <w:pPr>
         <w:pStyle w:val="Heading2"/>
+        <w:spacing w:line="360" w:lineRule="auto"/>
       </w:pPr>
       <w:r>
+        <w:rPr>
+          <w:rFonts w:ascii="Times New Roman" w:hAnsi="Times New Roman" w:eastAsia="Times New Roman"/>
+          <w:sz w:val="24"/>
+        </w:rPr>
         <w:t>8.1 Startup Lifecycle</w:t>
       </w:r>
     </w:p>
     <w:p>
+      <w:pPr>
+        <w:spacing w:line="360" w:lineRule="auto"/>
+      </w:pPr>
       <w:r>
+        <w:rPr>
+          <w:rFonts w:ascii="Times New Roman" w:hAnsi="Times New Roman" w:eastAsia="Times New Roman"/>
+          <w:sz w:val="24"/>
+        </w:rPr>
         <w:t>The app initializes bindings, retains splash, loads persisted token from shared preferences, validates session via /auth/me, and selects initial route based on restore result.</w:t>
       </w:r>
     </w:p>
     <w:p>
       <w:pPr>
         <w:pStyle w:val="Heading2"/>
+        <w:spacing w:line="360" w:lineRule="auto"/>
       </w:pPr>
       <w:r>
+        <w:rPr>
+          <w:rFonts w:ascii="Times New Roman" w:hAnsi="Times New Roman" w:eastAsia="Times New Roman"/>
+          <w:sz w:val="24"/>
+        </w:rPr>
         <w:t>8.2 State Layer</w:t>
       </w:r>
     </w:p>
     <w:p>
       <w:pPr>
         <w:pStyle w:val="ListBullet"/>
+        <w:spacing w:line="360" w:lineRule="auto"/>
       </w:pPr>
       <w:r>
+        <w:rPr>
+          <w:rFonts w:ascii="Times New Roman" w:hAnsi="Times New Roman" w:eastAsia="Times New Roman"/>
+          <w:sz w:val="24"/>
+        </w:rPr>
         <w:t>AuthProvider manages identity, token lifecycle, and auth status transitions.</w:t>
       </w:r>
     </w:p>
     <w:p>
       <w:pPr>
         <w:pStyle w:val="ListBullet"/>
+        <w:spacing w:line="360" w:lineRule="auto"/>
       </w:pPr>
       <w:r>
+        <w:rPr>
+          <w:rFonts w:ascii="Times New Roman" w:hAnsi="Times New Roman" w:eastAsia="Times New Roman"/>
+          <w:sz w:val="24"/>
+        </w:rPr>
         <w:t>DashboardProvider orchestrates role-specific data loading and operational actions.</w:t>
       </w:r>
     </w:p>
     <w:p>
       <w:pPr>
         <w:pStyle w:val="ListBullet"/>
+        <w:spacing w:line="360" w:lineRule="auto"/>
       </w:pPr>
       <w:r>
+        <w:rPr>
+          <w:rFonts w:ascii="Times New Roman" w:hAnsi="Times New Roman" w:eastAsia="Times New Roman"/>
+          <w:sz w:val="24"/>
+        </w:rPr>
         <w:t>CsvUploadProvider handles CSV parsing/preview/upload status machine.</w:t>
       </w:r>
     </w:p>
     <w:p>
       <w:pPr>
         <w:pStyle w:val="ListBullet"/>
+        <w:spacing w:line="360" w:lineRule="auto"/>
       </w:pPr>
       <w:r>
+        <w:rPr>
+          <w:rFonts w:ascii="Times New Roman" w:hAnsi="Times New Roman" w:eastAsia="Times New Roman"/>
+          <w:sz w:val="24"/>
+        </w:rPr>
         <w:t>OnboardingProvider currently includes mocked behavior and requires full API integration.</w:t>
       </w:r>
     </w:p>
     <w:p>
       <w:pPr>
         <w:pStyle w:val="Heading2"/>
+        <w:spacing w:line="360" w:lineRule="auto"/>
       </w:pPr>
       <w:r>
+        <w:rPr>
+          <w:rFonts w:ascii="Times New Roman" w:hAnsi="Times New Roman" w:eastAsia="Times New Roman"/>
+          <w:sz w:val="24"/>
+        </w:rPr>
         <w:t>8.3 UI Layer by Role</w:t>
       </w:r>
     </w:p>
     <w:p>
       <w:pPr>
         <w:pStyle w:val="ListBullet"/>
+        <w:spacing w:line="360" w:lineRule="auto"/>
       </w:pPr>
       <w:r>
+        <w:rPr>
+          <w:rFonts w:ascii="Times New Roman" w:hAnsi="Times New Roman" w:eastAsia="Times New Roman"/>
+          <w:sz w:val="24"/>
+        </w:rPr>
         <w:t>Parent dashboard: child status, tracking summary, notification preview.</w:t>
       </w:r>
     </w:p>
     <w:p>
       <w:pPr>
         <w:pStyle w:val="ListBullet"/>
+        <w:spacing w:line="360" w:lineRule="auto"/>
       </w:pPr>
       <w:r>
+        <w:rPr>
+          <w:rFonts w:ascii="Times New Roman" w:hAnsi="Times New Roman" w:eastAsia="Times New Roman"/>
+          <w:sz w:val="24"/>
+        </w:rPr>
         <w:t>Driver dashboard: trip controls, attendance actions, route/emergency shortcuts.</w:t>
       </w:r>
     </w:p>
     <w:p>
       <w:pPr>
         <w:pStyle w:val="ListBullet"/>
+        <w:spacing w:line="360" w:lineRule="auto"/>
       </w:pPr>
       <w:r>
+        <w:rPr>
+          <w:rFonts w:ascii="Times New Roman" w:hAnsi="Times New Roman" w:eastAsia="Times New Roman"/>
+          <w:sz w:val="24"/>
+        </w:rPr>
         <w:t>Admin dashboard: fleet metrics, event overview, reports, and CSV entry point.</w:t>
       </w:r>
     </w:p>
     <w:p>
       <w:pPr>
         <w:pStyle w:val="Heading2"/>
+        <w:spacing w:line="360" w:lineRule="auto"/>
       </w:pPr>
       <w:r>
+        <w:rPr>
+          <w:rFonts w:ascii="Times New Roman" w:hAnsi="Times New Roman" w:eastAsia="Times New Roman"/>
+          <w:sz w:val="24"/>
+        </w:rPr>
         <w:t>8.4 Map + Realtime Experience</w:t>
       </w:r>
     </w:p>
     <w:p>
+      <w:pPr>
+        <w:spacing w:line="360" w:lineRule="auto"/>
+      </w:pPr>
       <w:r>
+        <w:rPr>
+          <w:rFonts w:ascii="Times New Roman" w:hAnsi="Times New Roman" w:eastAsia="Times New Roman"/>
+          <w:sz w:val="24"/>
+        </w:rPr>
         <w:t>Parent live map combines polling with websocket subscription for trip updates. Additional admin/driver map experiences include demo coordinate datasets indicating partial telemetry integration maturity.</w:t>
       </w:r>
     </w:p>
     <w:p>
       <w:pPr>
         <w:pStyle w:val="Heading1"/>
+        <w:spacing w:line="360" w:lineRule="auto"/>
       </w:pPr>
       <w:r>
+        <w:rPr>
+          <w:rFonts w:ascii="Times New Roman" w:hAnsi="Times New Roman" w:eastAsia="Times New Roman"/>
+          <w:sz w:val="24"/>
+        </w:rPr>
         <w:t>9. API Surface and Contract Summary</w:t>
       </w:r>
     </w:p>
     <w:p>
+      <w:pPr>
+        <w:spacing w:line="360" w:lineRule="auto"/>
+      </w:pPr>
       <w:r>
+        <w:rPr>
+          <w:rFonts w:ascii="Times New Roman" w:hAnsi="Times New Roman" w:eastAsia="Times New Roman"/>
+          <w:sz w:val="24"/>
+        </w:rPr>
         <w:t>The API is grouped by business capability and role needs. Representative paths include /auth, /users, /students, /buses, /trips, /driver/trips, /parent/tracking, /attendance, /notifications, /dashboard, /csv-import, and /routes.</w:t>
       </w:r>
     </w:p>
     <w:p>
+      <w:pPr>
+        <w:spacing w:line="360" w:lineRule="auto"/>
+      </w:pPr>
       <w:r>
+        <w:rPr>
+          <w:rFonts w:ascii="Times New Roman" w:hAnsi="Times New Roman" w:eastAsia="Times New Roman"/>
+          <w:sz w:val="24"/>
+        </w:rPr>
         <w:t>Request/response contracts are DTO-driven with class-validator enforcement at the backend boundary.</w:t>
       </w:r>
     </w:p>
     <w:p>
       <w:pPr>
         <w:pStyle w:val="Heading1"/>
+        <w:spacing w:line="360" w:lineRule="auto"/>
       </w:pPr>
       <w:r>
+        <w:rPr>
+          <w:rFonts w:ascii="Times New Roman" w:hAnsi="Times New Roman" w:eastAsia="Times New Roman"/>
+          <w:sz w:val="24"/>
+        </w:rPr>
         <w:t>10. Database Design and Data Integrity</w:t>
       </w:r>
     </w:p>
     <w:p>
+      <w:pPr>
+        <w:spacing w:line="360" w:lineRule="auto"/>
+      </w:pPr>
       <w:r>
+        <w:rPr>
+          <w:rFonts w:ascii="Times New Roman" w:hAnsi="Times New Roman" w:eastAsia="Times New Roman"/>
+          <w:sz w:val="24"/>
+        </w:rPr>
         <w:t>The relational schema includes User, Session, Parent, Driver, Student, Bus, Trip, TripLocation, Attendance, and Notification models with enum-backed role and lifecycle states.</w:t>
       </w:r>
     </w:p>
     <w:p>
       <w:pPr>
         <w:pStyle w:val="ListBullet"/>
+        <w:spacing w:line="360" w:lineRule="auto"/>
       </w:pPr>
       <w:r>
+        <w:rPr>
+          <w:rFonts w:ascii="Times New Roman" w:hAnsi="Times New Roman" w:eastAsia="Times New Roman"/>
+          <w:sz w:val="24"/>
+        </w:rPr>
         <w:t>Uniqueness constraints on user email, session token, student code, and bus plate number.</w:t>
       </w:r>
     </w:p>
     <w:p>
       <w:pPr>
         <w:pStyle w:val="ListBullet"/>
+        <w:spacing w:line="360" w:lineRule="auto"/>
       </w:pPr>
       <w:r>
+        <w:rPr>
+          <w:rFonts w:ascii="Times New Roman" w:hAnsi="Times New Roman" w:eastAsia="Times New Roman"/>
+          <w:sz w:val="24"/>
+        </w:rPr>
         <w:t>Composite unique attendance(studentId, tripId) to enforce one attendance record per student per trip.</w:t>
       </w:r>
     </w:p>
     <w:p>
       <w:pPr>
         <w:pStyle w:val="ListBullet"/>
+        <w:spacing w:line="360" w:lineRule="auto"/>
       </w:pPr>
       <w:r>
+        <w:rPr>
+          <w:rFonts w:ascii="Times New Roman" w:hAnsi="Times New Roman" w:eastAsia="Times New Roman"/>
+          <w:sz w:val="24"/>
+        </w:rPr>
         <w:t>Indexes on trip date/status and trip location time series for operational reads.</w:t>
       </w:r>
     </w:p>
     <w:p>
       <w:pPr>
         <w:pStyle w:val="Heading1"/>
+        <w:spacing w:line="360" w:lineRule="auto"/>
       </w:pPr>
       <w:r>
+        <w:rPr>
+          <w:rFonts w:ascii="Times New Roman" w:hAnsi="Times New Roman" w:eastAsia="Times New Roman"/>
+          <w:sz w:val="24"/>
+        </w:rPr>
         <w:t>11. Security, Validation, and Reliability Controls</w:t>
       </w:r>
     </w:p>
     <w:p>
       <w:pPr>
         <w:pStyle w:val="ListBullet"/>
+        <w:spacing w:line="360" w:lineRule="auto"/>
       </w:pPr>
       <w:r>
+        <w:rPr>
+          <w:rFonts w:ascii="Times New Roman" w:hAnsi="Times New Roman" w:eastAsia="Times New Roman"/>
+          <w:sz w:val="24"/>
+        </w:rPr>
         <w:t>Global input validation with strict DTO field policy.</w:t>
       </w:r>
     </w:p>
     <w:p>
       <w:pPr>
         <w:pStyle w:val="ListBullet"/>
+        <w:spacing w:line="360" w:lineRule="auto"/>
       </w:pPr>
       <w:r>
+        <w:rPr>
+          <w:rFonts w:ascii="Times New Roman" w:hAnsi="Times New Roman" w:eastAsia="Times New Roman"/>
+          <w:sz w:val="24"/>
+        </w:rPr>
         <w:t>Role-based route authorization and authenticated session checks.</w:t>
       </w:r>
     </w:p>
     <w:p>
       <w:pPr>
         <w:pStyle w:val="ListBullet"/>
+        <w:spacing w:line="360" w:lineRule="auto"/>
       </w:pPr>
       <w:r>
+        <w:rPr>
+          <w:rFonts w:ascii="Times New Roman" w:hAnsi="Times New Roman" w:eastAsia="Times New Roman"/>
+          <w:sz w:val="24"/>
+        </w:rPr>
         <w:t>Password hashing via bcryptjs.</w:t>
       </w:r>
     </w:p>
     <w:p>
       <w:pPr>
         <w:pStyle w:val="ListBullet"/>
+        <w:spacing w:line="360" w:lineRule="auto"/>
       </w:pPr>
       <w:r>
+        <w:rPr>
+          <w:rFonts w:ascii="Times New Roman" w:hAnsi="Times New Roman" w:eastAsia="Times New Roman"/>
+          <w:sz w:val="24"/>
+        </w:rPr>
         <w:t>Global exception normalization and request logging for observability.</w:t>
       </w:r>
     </w:p>
     <w:p>
       <w:pPr>
         <w:pStyle w:val="Heading1"/>
+        <w:spacing w:line="360" w:lineRule="auto"/>
       </w:pPr>
       <w:r>
+        <w:rPr>
+          <w:rFonts w:ascii="Times New Roman" w:hAnsi="Times New Roman" w:eastAsia="Times New Roman"/>
+          <w:sz w:val="24"/>
+        </w:rPr>
         <w:t>12. Realtime Tracking and Notification Strategy</w:t>
       </w:r>
     </w:p>
     <w:p>
+      <w:pPr>
+        <w:spacing w:line="360" w:lineRule="auto"/>
+      </w:pPr>
       <w:r>
+        <w:rPr>
+          <w:rFonts w:ascii="Times New Roman" w:hAnsi="Times New Roman" w:eastAsia="Times New Roman"/>
+          <w:sz w:val="24"/>
+        </w:rPr>
         <w:t>Realtime tracking uses Socket.IO namespace /tracking with token-authenticated subscription to trip rooms. Driver location reports are persisted and emitted to subscribed clients. Notification workflows support role-targeted and student-targeted visibility with unread-state management.</w:t>
       </w:r>
     </w:p>
     <w:p>
       <w:pPr>
         <w:pStyle w:val="Heading1"/>
+        <w:spacing w:line="360" w:lineRule="auto"/>
       </w:pPr>
       <w:r>
+        <w:rPr>
+          <w:rFonts w:ascii="Times New Roman" w:hAnsi="Times New Roman" w:eastAsia="Times New Roman"/>
+          <w:sz w:val="24"/>
+        </w:rPr>
         <w:t>13. Testing, Quality, and Current Gaps</w:t>
       </w:r>
     </w:p>
     <w:p>
+      <w:pPr>
+        <w:spacing w:line="360" w:lineRule="auto"/>
+      </w:pPr>
       <w:r>
+        <w:rPr>
+          <w:rFonts w:ascii="Times New Roman" w:hAnsi="Times New Roman" w:eastAsia="Times New Roman"/>
+          <w:sz w:val="24"/>
+        </w:rPr>
         <w:t>The architecture is structured for testing but current project maturity indicates selective coverage and reliance on manual verification across some user flows.</w:t>
       </w:r>
     </w:p>
     <w:p>
       <w:pPr>
         <w:pStyle w:val="ListBullet"/>
+        <w:spacing w:line="360" w:lineRule="auto"/>
       </w:pPr>
       <w:r>
+        <w:rPr>
+          <w:rFonts w:ascii="Times New Roman" w:hAnsi="Times New Roman" w:eastAsia="Times New Roman"/>
+          <w:sz w:val="24"/>
+        </w:rPr>
         <w:t>Strengths: robust domain decomposition, clear role routing, meaningful implemented workflows.</w:t>
       </w:r>
     </w:p>
     <w:p>
       <w:pPr>
         <w:pStyle w:val="ListBullet"/>
+        <w:spacing w:line="360" w:lineRule="auto"/>
       </w:pPr>
       <w:r>
+        <w:rPr>
+          <w:rFonts w:ascii="Times New Roman" w:hAnsi="Times New Roman" w:eastAsia="Times New Roman"/>
+          <w:sz w:val="24"/>
+        </w:rPr>
         <w:t>Gaps: some mock/simulated flows, partial map telemetry coverage, unfinished UX actions.</w:t>
       </w:r>
     </w:p>
     <w:p>
       <w:pPr>
         <w:pStyle w:val="ListBullet"/>
+        <w:spacing w:line="360" w:lineRule="auto"/>
       </w:pPr>
       <w:r>
+        <w:rPr>
+          <w:rFonts w:ascii="Times New Roman" w:hAnsi="Times New Roman" w:eastAsia="Times New Roman"/>
+          <w:sz w:val="24"/>
+        </w:rPr>
         <w:t>Gap impact: lowers confidence for high-scale production readiness without further hardening.</w:t>
       </w:r>
     </w:p>
     <w:p>
       <w:pPr>
         <w:pStyle w:val="Heading1"/>
+        <w:spacing w:line="360" w:lineRule="auto"/>
       </w:pPr>
       <w:r>
+        <w:rPr>
+          <w:rFonts w:ascii="Times New Roman" w:hAnsi="Times New Roman" w:eastAsia="Times New Roman"/>
+          <w:sz w:val="24"/>
+        </w:rPr>
         <w:t>14. Deployment and Operational Readiness</w:t>
       </w:r>
     </w:p>
     <w:p>
+      <w:pPr>
+        <w:spacing w:line="360" w:lineRule="auto"/>
+      </w:pPr>
       <w:r>
+        <w:rPr>
+          <w:rFonts w:ascii="Times New Roman" w:hAnsi="Times New Roman" w:eastAsia="Times New Roman"/>
+          <w:sz w:val="24"/>
+        </w:rPr>
         <w:t>Backend supports standard Nest build/start scripts and environment-based runtime configuration. Production readiness requires tightened CORS origins, stronger mobile token storage posture, and comprehensive monitoring/test strategy.</w:t>
       </w:r>
     </w:p>
     <w:p>
       <w:pPr>
         <w:pStyle w:val="Heading1"/>
+        <w:spacing w:line="360" w:lineRule="auto"/>
       </w:pPr>
       <w:r>
+        <w:rPr>
+          <w:rFonts w:ascii="Times New Roman" w:hAnsi="Times New Roman" w:eastAsia="Times New Roman"/>
+          <w:sz w:val="24"/>
+        </w:rPr>
         <w:t>15. Risks, Limitations, and Improvement Roadmap</w:t>
       </w:r>
     </w:p>
     <w:p>
       <w:pPr>
         <w:pStyle w:val="ListBullet"/>
+        <w:spacing w:line="360" w:lineRule="auto"/>
       </w:pPr>
       <w:r>
+        <w:rPr>
+          <w:rFonts w:ascii="Times New Roman" w:hAnsi="Times New Roman" w:eastAsia="Times New Roman"/>
+          <w:sz w:val="24"/>
+        </w:rPr>
         <w:t>Implement complete emergency alert backend integration and escalation paths.</w:t>
       </w:r>
     </w:p>
     <w:p>
       <w:pPr>
         <w:pStyle w:val="ListBullet"/>
+        <w:spacing w:line="360" w:lineRule="auto"/>
       </w:pPr>
       <w:r>
+        <w:rPr>
+          <w:rFonts w:ascii="Times New Roman" w:hAnsi="Times New Roman" w:eastAsia="Times New Roman"/>
+          <w:sz w:val="24"/>
+        </w:rPr>
         <w:t>Replace demo map datasets with live fleet telemetry in all relevant screens.</w:t>
       </w:r>
     </w:p>
     <w:p>
       <w:pPr>
         <w:pStyle w:val="ListBullet"/>
+        <w:spacing w:line="360" w:lineRule="auto"/>
       </w:pPr>
       <w:r>
+        <w:rPr>
+          <w:rFonts w:ascii="Times New Roman" w:hAnsi="Times New Roman" w:eastAsia="Times New Roman"/>
+          <w:sz w:val="24"/>
+        </w:rPr>
         <w:t>Migrate mobile token persistence to secure keystore/keychain-backed storage.</w:t>
       </w:r>
     </w:p>
     <w:p>
       <w:pPr>
         <w:pStyle w:val="ListBullet"/>
+        <w:spacing w:line="360" w:lineRule="auto"/>
       </w:pPr>
       <w:r>
+        <w:rPr>
+          <w:rFonts w:ascii="Times New Roman" w:hAnsi="Times New Roman" w:eastAsia="Times New Roman"/>
+          <w:sz w:val="24"/>
+        </w:rPr>
         <w:t>Introduce session refresh/renewal strategy and consistent retry/backoff policy.</w:t>
       </w:r>
     </w:p>
     <w:p>
       <w:pPr>
         <w:pStyle w:val="ListBullet"/>
+        <w:spacing w:line="360" w:lineRule="auto"/>
       </w:pPr>
       <w:r>
+        <w:rPr>
+          <w:rFonts w:ascii="Times New Roman" w:hAnsi="Times New Roman" w:eastAsia="Times New Roman"/>
+          <w:sz w:val="24"/>
+        </w:rPr>
         <w:t>Expand automated tests across backend domain logic and Flutter UI/service integration.</w:t>
       </w:r>
     </w:p>
     <w:p>
       <w:pPr>
         <w:pStyle w:val="ListBullet"/>
+        <w:spacing w:line="360" w:lineRule="auto"/>
       </w:pPr>
       <w:r>
+        <w:rPr>
+          <w:rFonts w:ascii="Times New Roman" w:hAnsi="Times New Roman" w:eastAsia="Times New Roman"/>
+          <w:sz w:val="24"/>
+        </w:rPr>
         <w:t>Eliminate placeholder UX routes and fully complete onboarding and recovery flows.</w:t>
       </w:r>
     </w:p>
     <w:p>
       <w:pPr>
         <w:pStyle w:val="Heading1"/>
+        <w:spacing w:line="360" w:lineRule="auto"/>
       </w:pPr>
       <w:r>
+        <w:rPr>
+          <w:rFonts w:ascii="Times New Roman" w:hAnsi="Times New Roman" w:eastAsia="Times New Roman"/>
+          <w:sz w:val="24"/>
+        </w:rPr>
         <w:t>16. Conclusion</w:t>
       </w:r>
     </w:p>
     <w:p>
+      <w:pPr>
+        <w:spacing w:line="360" w:lineRule="auto"/>
+      </w:pPr>
       <w:r>
+        <w:rPr>
+          <w:rFonts w:ascii="Times New Roman" w:hAnsi="Times New Roman" w:eastAsia="Times New Roman"/>
+          <w:sz w:val="24"/>
+        </w:rPr>
         <w:t>SafeRide is a solid MVP-stage system with a credible technical backbone and real user-facing functionality across core school transport operations. The project can evolve to full production by completing identified hardening and integration items while preserving its existing architecture strengths.</w:t>
       </w:r>
     </w:p>
     <w:p>
+      <w:pPr>
+        <w:spacing w:line="360" w:lineRule="auto"/>
+      </w:pPr>
       <w:r>
+        <w:rPr>
+          <w:rFonts w:ascii="Times New Roman" w:hAnsi="Times New Roman" w:eastAsia="Times New Roman"/>
+          <w:sz w:val="24"/>
+        </w:rPr>
         <w:br w:type="page"/>
       </w:r>
     </w:p>
     <w:p>
       <w:pPr>
         <w:pStyle w:val="Heading1"/>
+        <w:spacing w:line="360" w:lineRule="auto"/>
       </w:pPr>
       <w:r>
+        <w:rPr>
+          <w:rFonts w:ascii="Times New Roman" w:hAnsi="Times New Roman" w:eastAsia="Times New Roman"/>
+          <w:sz w:val="24"/>
+        </w:rPr>
         <w:t>Appendix A: Full Source Diagram Pages (Embedded)</w:t>
       </w:r>
     </w:p>
     <w:p>
+      <w:pPr>
+        <w:spacing w:line="360" w:lineRule="auto"/>
+      </w:pPr>
       <w:r>
+        <w:rPr>
+          <w:rFonts w:ascii="Times New Roman" w:hAnsi="Times New Roman" w:eastAsia="Times New Roman"/>
+          <w:sz w:val="24"/>
+        </w:rPr>
         <w:t>All pages extracted from the provided PDFs are embedded below for complete visual inclusion and traceability.</w:t>
       </w:r>
     </w:p>
     <w:p>
+      <w:pPr>
+        <w:spacing w:line="360" w:lineRule="auto"/>
+      </w:pPr>
       <w:r>
+        <w:rPr>
+          <w:rFonts w:ascii="Times New Roman" w:hAnsi="Times New Roman" w:eastAsia="Times New Roman"/>
+          <w:sz w:val="24"/>
+        </w:rPr>
         <w:drawing>
           <wp:inline xmlns:a="http://schemas.openxmlformats.org/drawingml/2006/main" xmlns:pic="http://schemas.openxmlformats.org/drawingml/2006/picture">
             <wp:extent cx="5669280" cy="7336715"/>
@@ -949,7 +1855,7 @@
               <a:graphicData uri="http://schemas.openxmlformats.org/drawingml/2006/picture">
                 <pic:pic>
                   <pic:nvPicPr>
-                    <pic:cNvPr id="0" name="mobile-01.png"/>
+                    <pic:cNvPr id="1" name="mobile-01.png"/>
                     <pic:cNvPicPr/>
                   </pic:nvPicPr>
                   <pic:blipFill>
@@ -973,15 +1879,27 @@
       </w:r>
     </w:p>
     <w:p>
+      <w:pPr>
+        <w:spacing w:line="360" w:lineRule="auto"/>
+      </w:pPr>
       <w:r>
         <w:rPr>
+          <w:rFonts w:ascii="Times New Roman" w:hAnsi="Times New Roman" w:eastAsia="Times New Roman"/>
           <w:i/>
+          <w:sz w:val="24"/>
         </w:rPr>
         <w:t>Figure: Source page 1: mobile-01.png</w:t>
       </w:r>
     </w:p>
     <w:p>
+      <w:pPr>
+        <w:spacing w:line="360" w:lineRule="auto"/>
+      </w:pPr>
       <w:r>
+        <w:rPr>
+          <w:rFonts w:ascii="Times New Roman" w:hAnsi="Times New Roman" w:eastAsia="Times New Roman"/>
+          <w:sz w:val="24"/>
+        </w:rPr>
         <w:drawing>
           <wp:inline xmlns:a="http://schemas.openxmlformats.org/drawingml/2006/main" xmlns:pic="http://schemas.openxmlformats.org/drawingml/2006/picture">
             <wp:extent cx="5669280" cy="7336715"/>
@@ -993,7 +1911,7 @@
               <a:graphicData uri="http://schemas.openxmlformats.org/drawingml/2006/picture">
                 <pic:pic>
                   <pic:nvPicPr>
-                    <pic:cNvPr id="0" name="mobile-02.png"/>
+                    <pic:cNvPr id="2" name="mobile-02.png"/>
                     <pic:cNvPicPr/>
                   </pic:nvPicPr>
                   <pic:blipFill>
@@ -1017,15 +1935,27 @@
       </w:r>
     </w:p>
     <w:p>
+      <w:pPr>
+        <w:spacing w:line="360" w:lineRule="auto"/>
+      </w:pPr>
       <w:r>
         <w:rPr>
+          <w:rFonts w:ascii="Times New Roman" w:hAnsi="Times New Roman" w:eastAsia="Times New Roman"/>
           <w:i/>
+          <w:sz w:val="24"/>
         </w:rPr>
         <w:t>Figure: Source page 2: mobile-02.png</w:t>
       </w:r>
     </w:p>
     <w:p>
+      <w:pPr>
+        <w:spacing w:line="360" w:lineRule="auto"/>
+      </w:pPr>
       <w:r>
+        <w:rPr>
+          <w:rFonts w:ascii="Times New Roman" w:hAnsi="Times New Roman" w:eastAsia="Times New Roman"/>
+          <w:sz w:val="24"/>
+        </w:rPr>
         <w:drawing>
           <wp:inline xmlns:a="http://schemas.openxmlformats.org/drawingml/2006/main" xmlns:pic="http://schemas.openxmlformats.org/drawingml/2006/picture">
             <wp:extent cx="5669280" cy="7336715"/>
@@ -1037,7 +1967,7 @@
               <a:graphicData uri="http://schemas.openxmlformats.org/drawingml/2006/picture">
                 <pic:pic>
                   <pic:nvPicPr>
-                    <pic:cNvPr id="0" name="mobile-03.png"/>
+                    <pic:cNvPr id="3" name="mobile-03.png"/>
                     <pic:cNvPicPr/>
                   </pic:nvPicPr>
                   <pic:blipFill>
@@ -1061,15 +1991,27 @@
       </w:r>
     </w:p>
     <w:p>
+      <w:pPr>
+        <w:spacing w:line="360" w:lineRule="auto"/>
+      </w:pPr>
       <w:r>
         <w:rPr>
+          <w:rFonts w:ascii="Times New Roman" w:hAnsi="Times New Roman" w:eastAsia="Times New Roman"/>
           <w:i/>
+          <w:sz w:val="24"/>
         </w:rPr>
         <w:t>Figure: Source page 3: mobile-03.png</w:t>
       </w:r>
     </w:p>
     <w:p>
+      <w:pPr>
+        <w:spacing w:line="360" w:lineRule="auto"/>
+      </w:pPr>
       <w:r>
+        <w:rPr>
+          <w:rFonts w:ascii="Times New Roman" w:hAnsi="Times New Roman" w:eastAsia="Times New Roman"/>
+          <w:sz w:val="24"/>
+        </w:rPr>
         <w:drawing>
           <wp:inline xmlns:a="http://schemas.openxmlformats.org/drawingml/2006/main" xmlns:pic="http://schemas.openxmlformats.org/drawingml/2006/picture">
             <wp:extent cx="5669280" cy="7336715"/>
@@ -1081,7 +2023,7 @@
               <a:graphicData uri="http://schemas.openxmlformats.org/drawingml/2006/picture">
                 <pic:pic>
                   <pic:nvPicPr>
-                    <pic:cNvPr id="0" name="mobile-04.png"/>
+                    <pic:cNvPr id="4" name="mobile-04.png"/>
                     <pic:cNvPicPr/>
                   </pic:nvPicPr>
                   <pic:blipFill>
@@ -1105,15 +2047,27 @@
       </w:r>
     </w:p>
     <w:p>
+      <w:pPr>
+        <w:spacing w:line="360" w:lineRule="auto"/>
+      </w:pPr>
       <w:r>
         <w:rPr>
+          <w:rFonts w:ascii="Times New Roman" w:hAnsi="Times New Roman" w:eastAsia="Times New Roman"/>
           <w:i/>
+          <w:sz w:val="24"/>
         </w:rPr>
         <w:t>Figure: Source page 4: mobile-04.png</w:t>
       </w:r>
     </w:p>
     <w:p>
+      <w:pPr>
+        <w:spacing w:line="360" w:lineRule="auto"/>
+      </w:pPr>
       <w:r>
+        <w:rPr>
+          <w:rFonts w:ascii="Times New Roman" w:hAnsi="Times New Roman" w:eastAsia="Times New Roman"/>
+          <w:sz w:val="24"/>
+        </w:rPr>
         <w:drawing>
           <wp:inline xmlns:a="http://schemas.openxmlformats.org/drawingml/2006/main" xmlns:pic="http://schemas.openxmlformats.org/drawingml/2006/picture">
             <wp:extent cx="5669280" cy="7336715"/>
@@ -1125,7 +2079,7 @@
               <a:graphicData uri="http://schemas.openxmlformats.org/drawingml/2006/picture">
                 <pic:pic>
                   <pic:nvPicPr>
-                    <pic:cNvPr id="0" name="mobile-05.png"/>
+                    <pic:cNvPr id="5" name="mobile-05.png"/>
                     <pic:cNvPicPr/>
                   </pic:nvPicPr>
                   <pic:blipFill>
@@ -1149,15 +2103,27 @@
       </w:r>
     </w:p>
     <w:p>
+      <w:pPr>
+        <w:spacing w:line="360" w:lineRule="auto"/>
+      </w:pPr>
       <w:r>
         <w:rPr>
+          <w:rFonts w:ascii="Times New Roman" w:hAnsi="Times New Roman" w:eastAsia="Times New Roman"/>
           <w:i/>
+          <w:sz w:val="24"/>
         </w:rPr>
         <w:t>Figure: Source page 5: mobile-05.png</w:t>
       </w:r>
     </w:p>
     <w:p>
+      <w:pPr>
+        <w:spacing w:line="360" w:lineRule="auto"/>
+      </w:pPr>
       <w:r>
+        <w:rPr>
+          <w:rFonts w:ascii="Times New Roman" w:hAnsi="Times New Roman" w:eastAsia="Times New Roman"/>
+          <w:sz w:val="24"/>
+        </w:rPr>
         <w:drawing>
           <wp:inline xmlns:a="http://schemas.openxmlformats.org/drawingml/2006/main" xmlns:pic="http://schemas.openxmlformats.org/drawingml/2006/picture">
             <wp:extent cx="5669280" cy="7336715"/>
@@ -1169,7 +2135,7 @@
               <a:graphicData uri="http://schemas.openxmlformats.org/drawingml/2006/picture">
                 <pic:pic>
                   <pic:nvPicPr>
-                    <pic:cNvPr id="0" name="mobile-06.png"/>
+                    <pic:cNvPr id="6" name="mobile-06.png"/>
                     <pic:cNvPicPr/>
                   </pic:nvPicPr>
                   <pic:blipFill>
@@ -1193,15 +2159,27 @@
       </w:r>
     </w:p>
     <w:p>
+      <w:pPr>
+        <w:spacing w:line="360" w:lineRule="auto"/>
+      </w:pPr>
       <w:r>
         <w:rPr>
+          <w:rFonts w:ascii="Times New Roman" w:hAnsi="Times New Roman" w:eastAsia="Times New Roman"/>
           <w:i/>
+          <w:sz w:val="24"/>
         </w:rPr>
         <w:t>Figure: Source page 6: mobile-06.png</w:t>
       </w:r>
     </w:p>
     <w:p>
+      <w:pPr>
+        <w:spacing w:line="360" w:lineRule="auto"/>
+      </w:pPr>
       <w:r>
+        <w:rPr>
+          <w:rFonts w:ascii="Times New Roman" w:hAnsi="Times New Roman" w:eastAsia="Times New Roman"/>
+          <w:sz w:val="24"/>
+        </w:rPr>
         <w:drawing>
           <wp:inline xmlns:a="http://schemas.openxmlformats.org/drawingml/2006/main" xmlns:pic="http://schemas.openxmlformats.org/drawingml/2006/picture">
             <wp:extent cx="5669280" cy="7336715"/>
@@ -1213,7 +2191,7 @@
               <a:graphicData uri="http://schemas.openxmlformats.org/drawingml/2006/picture">
                 <pic:pic>
                   <pic:nvPicPr>
-                    <pic:cNvPr id="0" name="mobile-07.png"/>
+                    <pic:cNvPr id="7" name="mobile-07.png"/>
                     <pic:cNvPicPr/>
                   </pic:nvPicPr>
                   <pic:blipFill>
@@ -1237,15 +2215,27 @@
       </w:r>
     </w:p>
     <w:p>
+      <w:pPr>
+        <w:spacing w:line="360" w:lineRule="auto"/>
+      </w:pPr>
       <w:r>
         <w:rPr>
+          <w:rFonts w:ascii="Times New Roman" w:hAnsi="Times New Roman" w:eastAsia="Times New Roman"/>
           <w:i/>
+          <w:sz w:val="24"/>
         </w:rPr>
         <w:t>Figure: Source page 7: mobile-07.png</w:t>
       </w:r>
     </w:p>
     <w:p>
+      <w:pPr>
+        <w:spacing w:line="360" w:lineRule="auto"/>
+      </w:pPr>
       <w:r>
+        <w:rPr>
+          <w:rFonts w:ascii="Times New Roman" w:hAnsi="Times New Roman" w:eastAsia="Times New Roman"/>
+          <w:sz w:val="24"/>
+        </w:rPr>
         <w:drawing>
           <wp:inline xmlns:a="http://schemas.openxmlformats.org/drawingml/2006/main" xmlns:pic="http://schemas.openxmlformats.org/drawingml/2006/picture">
             <wp:extent cx="5669280" cy="7336715"/>
@@ -1257,7 +2247,7 @@
               <a:graphicData uri="http://schemas.openxmlformats.org/drawingml/2006/picture">
                 <pic:pic>
                   <pic:nvPicPr>
-                    <pic:cNvPr id="0" name="mobile-08.png"/>
+                    <pic:cNvPr id="8" name="mobile-08.png"/>
                     <pic:cNvPicPr/>
                   </pic:nvPicPr>
                   <pic:blipFill>
@@ -1281,15 +2271,27 @@
       </w:r>
     </w:p>
     <w:p>
+      <w:pPr>
+        <w:spacing w:line="360" w:lineRule="auto"/>
+      </w:pPr>
       <w:r>
         <w:rPr>
+          <w:rFonts w:ascii="Times New Roman" w:hAnsi="Times New Roman" w:eastAsia="Times New Roman"/>
           <w:i/>
+          <w:sz w:val="24"/>
         </w:rPr>
         <w:t>Figure: Source page 8: mobile-08.png</w:t>
       </w:r>
     </w:p>
     <w:p>
+      <w:pPr>
+        <w:spacing w:line="360" w:lineRule="auto"/>
+      </w:pPr>
       <w:r>
+        <w:rPr>
+          <w:rFonts w:ascii="Times New Roman" w:hAnsi="Times New Roman" w:eastAsia="Times New Roman"/>
+          <w:sz w:val="24"/>
+        </w:rPr>
         <w:drawing>
           <wp:inline xmlns:a="http://schemas.openxmlformats.org/drawingml/2006/main" xmlns:pic="http://schemas.openxmlformats.org/drawingml/2006/picture">
             <wp:extent cx="5669280" cy="7336715"/>
@@ -1301,7 +2303,7 @@
               <a:graphicData uri="http://schemas.openxmlformats.org/drawingml/2006/picture">
                 <pic:pic>
                   <pic:nvPicPr>
-                    <pic:cNvPr id="0" name="mobile-09.png"/>
+                    <pic:cNvPr id="9" name="mobile-09.png"/>
                     <pic:cNvPicPr/>
                   </pic:nvPicPr>
                   <pic:blipFill>
@@ -1325,15 +2327,27 @@
       </w:r>
     </w:p>
     <w:p>
+      <w:pPr>
+        <w:spacing w:line="360" w:lineRule="auto"/>
+      </w:pPr>
       <w:r>
         <w:rPr>
+          <w:rFonts w:ascii="Times New Roman" w:hAnsi="Times New Roman" w:eastAsia="Times New Roman"/>
           <w:i/>
+          <w:sz w:val="24"/>
         </w:rPr>
         <w:t>Figure: Source page 9: mobile-09.png</w:t>
       </w:r>
     </w:p>
     <w:p>
+      <w:pPr>
+        <w:spacing w:line="360" w:lineRule="auto"/>
+      </w:pPr>
       <w:r>
+        <w:rPr>
+          <w:rFonts w:ascii="Times New Roman" w:hAnsi="Times New Roman" w:eastAsia="Times New Roman"/>
+          <w:sz w:val="24"/>
+        </w:rPr>
         <w:drawing>
           <wp:inline xmlns:a="http://schemas.openxmlformats.org/drawingml/2006/main" xmlns:pic="http://schemas.openxmlformats.org/drawingml/2006/picture">
             <wp:extent cx="5669280" cy="7336715"/>
@@ -1345,7 +2359,7 @@
               <a:graphicData uri="http://schemas.openxmlformats.org/drawingml/2006/picture">
                 <pic:pic>
                   <pic:nvPicPr>
-                    <pic:cNvPr id="0" name="mobile-10.png"/>
+                    <pic:cNvPr id="10" name="mobile-10.png"/>
                     <pic:cNvPicPr/>
                   </pic:nvPicPr>
                   <pic:blipFill>
@@ -1369,15 +2383,27 @@
       </w:r>
     </w:p>
     <w:p>
+      <w:pPr>
+        <w:spacing w:line="360" w:lineRule="auto"/>
+      </w:pPr>
       <w:r>
         <w:rPr>
+          <w:rFonts w:ascii="Times New Roman" w:hAnsi="Times New Roman" w:eastAsia="Times New Roman"/>
           <w:i/>
+          <w:sz w:val="24"/>
         </w:rPr>
         <w:t>Figure: Source page 10: mobile-10.png</w:t>
       </w:r>
     </w:p>
     <w:p>
+      <w:pPr>
+        <w:spacing w:line="360" w:lineRule="auto"/>
+      </w:pPr>
       <w:r>
+        <w:rPr>
+          <w:rFonts w:ascii="Times New Roman" w:hAnsi="Times New Roman" w:eastAsia="Times New Roman"/>
+          <w:sz w:val="24"/>
+        </w:rPr>
         <w:drawing>
           <wp:inline xmlns:a="http://schemas.openxmlformats.org/drawingml/2006/main" xmlns:pic="http://schemas.openxmlformats.org/drawingml/2006/picture">
             <wp:extent cx="5669280" cy="7336715"/>
@@ -1389,7 +2415,7 @@
               <a:graphicData uri="http://schemas.openxmlformats.org/drawingml/2006/picture">
                 <pic:pic>
                   <pic:nvPicPr>
-                    <pic:cNvPr id="0" name="mobile-11.png"/>
+                    <pic:cNvPr id="11" name="mobile-11.png"/>
                     <pic:cNvPicPr/>
                   </pic:nvPicPr>
                   <pic:blipFill>
@@ -1413,15 +2439,27 @@
       </w:r>
     </w:p>
     <w:p>
+      <w:pPr>
+        <w:spacing w:line="360" w:lineRule="auto"/>
+      </w:pPr>
       <w:r>
         <w:rPr>
+          <w:rFonts w:ascii="Times New Roman" w:hAnsi="Times New Roman" w:eastAsia="Times New Roman"/>
           <w:i/>
+          <w:sz w:val="24"/>
         </w:rPr>
         <w:t>Figure: Source page 11: mobile-11.png</w:t>
       </w:r>
     </w:p>
     <w:p>
+      <w:pPr>
+        <w:spacing w:line="360" w:lineRule="auto"/>
+      </w:pPr>
       <w:r>
+        <w:rPr>
+          <w:rFonts w:ascii="Times New Roman" w:hAnsi="Times New Roman" w:eastAsia="Times New Roman"/>
+          <w:sz w:val="24"/>
+        </w:rPr>
         <w:drawing>
           <wp:inline xmlns:a="http://schemas.openxmlformats.org/drawingml/2006/main" xmlns:pic="http://schemas.openxmlformats.org/drawingml/2006/picture">
             <wp:extent cx="5669280" cy="7336715"/>
@@ -1433,7 +2471,7 @@
               <a:graphicData uri="http://schemas.openxmlformats.org/drawingml/2006/picture">
                 <pic:pic>
                   <pic:nvPicPr>
-                    <pic:cNvPr id="0" name="mobile-12.png"/>
+                    <pic:cNvPr id="12" name="mobile-12.png"/>
                     <pic:cNvPicPr/>
                   </pic:nvPicPr>
                   <pic:blipFill>
@@ -1457,15 +2495,27 @@
       </w:r>
     </w:p>
     <w:p>
+      <w:pPr>
+        <w:spacing w:line="360" w:lineRule="auto"/>
+      </w:pPr>
       <w:r>
         <w:rPr>
+          <w:rFonts w:ascii="Times New Roman" w:hAnsi="Times New Roman" w:eastAsia="Times New Roman"/>
           <w:i/>
+          <w:sz w:val="24"/>
         </w:rPr>
         <w:t>Figure: Source page 12: mobile-12.png</w:t>
       </w:r>
     </w:p>
     <w:p>
+      <w:pPr>
+        <w:spacing w:line="360" w:lineRule="auto"/>
+      </w:pPr>
       <w:r>
+        <w:rPr>
+          <w:rFonts w:ascii="Times New Roman" w:hAnsi="Times New Roman" w:eastAsia="Times New Roman"/>
+          <w:sz w:val="24"/>
+        </w:rPr>
         <w:drawing>
           <wp:inline xmlns:a="http://schemas.openxmlformats.org/drawingml/2006/main" xmlns:pic="http://schemas.openxmlformats.org/drawingml/2006/picture">
             <wp:extent cx="5669280" cy="7336715"/>
@@ -1477,7 +2527,7 @@
               <a:graphicData uri="http://schemas.openxmlformats.org/drawingml/2006/picture">
                 <pic:pic>
                   <pic:nvPicPr>
-                    <pic:cNvPr id="0" name="implementation-1.png"/>
+                    <pic:cNvPr id="13" name="implementation-1.png"/>
                     <pic:cNvPicPr/>
                   </pic:nvPicPr>
                   <pic:blipFill>
@@ -1501,15 +2551,27 @@
       </w:r>
     </w:p>
     <w:p>
+      <w:pPr>
+        <w:spacing w:line="360" w:lineRule="auto"/>
+      </w:pPr>
       <w:r>
         <w:rPr>
+          <w:rFonts w:ascii="Times New Roman" w:hAnsi="Times New Roman" w:eastAsia="Times New Roman"/>
           <w:i/>
+          <w:sz w:val="24"/>
         </w:rPr>
         <w:t>Figure: Source page 13: implementation-1.png</w:t>
       </w:r>
     </w:p>
     <w:p>
+      <w:pPr>
+        <w:spacing w:line="360" w:lineRule="auto"/>
+      </w:pPr>
       <w:r>
+        <w:rPr>
+          <w:rFonts w:ascii="Times New Roman" w:hAnsi="Times New Roman" w:eastAsia="Times New Roman"/>
+          <w:sz w:val="24"/>
+        </w:rPr>
         <w:drawing>
           <wp:inline xmlns:a="http://schemas.openxmlformats.org/drawingml/2006/main" xmlns:pic="http://schemas.openxmlformats.org/drawingml/2006/picture">
             <wp:extent cx="5669280" cy="7336715"/>
@@ -1521,7 +2583,7 @@
               <a:graphicData uri="http://schemas.openxmlformats.org/drawingml/2006/picture">
                 <pic:pic>
                   <pic:nvPicPr>
-                    <pic:cNvPr id="0" name="implementation-2.png"/>
+                    <pic:cNvPr id="14" name="implementation-2.png"/>
                     <pic:cNvPicPr/>
                   </pic:nvPicPr>
                   <pic:blipFill>
@@ -1545,15 +2607,27 @@
       </w:r>
     </w:p>
     <w:p>
+      <w:pPr>
+        <w:spacing w:line="360" w:lineRule="auto"/>
+      </w:pPr>
       <w:r>
         <w:rPr>
+          <w:rFonts w:ascii="Times New Roman" w:hAnsi="Times New Roman" w:eastAsia="Times New Roman"/>
           <w:i/>
+          <w:sz w:val="24"/>
         </w:rPr>
         <w:t>Figure: Source page 14: implementation-2.png</w:t>
       </w:r>
     </w:p>
     <w:p>
+      <w:pPr>
+        <w:spacing w:line="360" w:lineRule="auto"/>
+      </w:pPr>
       <w:r>
+        <w:rPr>
+          <w:rFonts w:ascii="Times New Roman" w:hAnsi="Times New Roman" w:eastAsia="Times New Roman"/>
+          <w:sz w:val="24"/>
+        </w:rPr>
         <w:drawing>
           <wp:inline xmlns:a="http://schemas.openxmlformats.org/drawingml/2006/main" xmlns:pic="http://schemas.openxmlformats.org/drawingml/2006/picture">
             <wp:extent cx="5669280" cy="7336715"/>
@@ -1565,7 +2639,7 @@
               <a:graphicData uri="http://schemas.openxmlformats.org/drawingml/2006/picture">
                 <pic:pic>
                   <pic:nvPicPr>
-                    <pic:cNvPr id="0" name="implementation-3.png"/>
+                    <pic:cNvPr id="15" name="implementation-3.png"/>
                     <pic:cNvPicPr/>
                   </pic:nvPicPr>
                   <pic:blipFill>
@@ -1589,15 +2663,27 @@
       </w:r>
     </w:p>
     <w:p>
+      <w:pPr>
+        <w:spacing w:line="360" w:lineRule="auto"/>
+      </w:pPr>
       <w:r>
         <w:rPr>
+          <w:rFonts w:ascii="Times New Roman" w:hAnsi="Times New Roman" w:eastAsia="Times New Roman"/>
           <w:i/>
+          <w:sz w:val="24"/>
         </w:rPr>
         <w:t>Figure: Source page 15: implementation-3.png</w:t>
       </w:r>
     </w:p>
     <w:p>
+      <w:pPr>
+        <w:spacing w:line="360" w:lineRule="auto"/>
+      </w:pPr>
       <w:r>
+        <w:rPr>
+          <w:rFonts w:ascii="Times New Roman" w:hAnsi="Times New Roman" w:eastAsia="Times New Roman"/>
+          <w:sz w:val="24"/>
+        </w:rPr>
         <w:drawing>
           <wp:inline xmlns:a="http://schemas.openxmlformats.org/drawingml/2006/main" xmlns:pic="http://schemas.openxmlformats.org/drawingml/2006/picture">
             <wp:extent cx="5669280" cy="7336715"/>
@@ -1609,7 +2695,7 @@
               <a:graphicData uri="http://schemas.openxmlformats.org/drawingml/2006/picture">
                 <pic:pic>
                   <pic:nvPicPr>
-                    <pic:cNvPr id="0" name="implementation-4.png"/>
+                    <pic:cNvPr id="16" name="implementation-4.png"/>
                     <pic:cNvPicPr/>
                   </pic:nvPicPr>
                   <pic:blipFill>
@@ -1633,15 +2719,27 @@
       </w:r>
     </w:p>
     <w:p>
+      <w:pPr>
+        <w:spacing w:line="360" w:lineRule="auto"/>
+      </w:pPr>
       <w:r>
         <w:rPr>
+          <w:rFonts w:ascii="Times New Roman" w:hAnsi="Times New Roman" w:eastAsia="Times New Roman"/>
           <w:i/>
+          <w:sz w:val="24"/>
         </w:rPr>
         <w:t>Figure: Source page 16: implementation-4.png</w:t>
       </w:r>
     </w:p>
     <w:p>
+      <w:pPr>
+        <w:spacing w:line="360" w:lineRule="auto"/>
+      </w:pPr>
       <w:r>
+        <w:rPr>
+          <w:rFonts w:ascii="Times New Roman" w:hAnsi="Times New Roman" w:eastAsia="Times New Roman"/>
+          <w:sz w:val="24"/>
+        </w:rPr>
         <w:drawing>
           <wp:inline xmlns:a="http://schemas.openxmlformats.org/drawingml/2006/main" xmlns:pic="http://schemas.openxmlformats.org/drawingml/2006/picture">
             <wp:extent cx="5669280" cy="7336715"/>
@@ -1653,7 +2751,7 @@
               <a:graphicData uri="http://schemas.openxmlformats.org/drawingml/2006/picture">
                 <pic:pic>
                   <pic:nvPicPr>
-                    <pic:cNvPr id="0" name="implementation-5.png"/>
+                    <pic:cNvPr id="17" name="implementation-5.png"/>
                     <pic:cNvPicPr/>
                   </pic:nvPicPr>
                   <pic:blipFill>
@@ -1677,15 +2775,27 @@
       </w:r>
     </w:p>
     <w:p>
+      <w:pPr>
+        <w:spacing w:line="360" w:lineRule="auto"/>
+      </w:pPr>
       <w:r>
         <w:rPr>
+          <w:rFonts w:ascii="Times New Roman" w:hAnsi="Times New Roman" w:eastAsia="Times New Roman"/>
           <w:i/>
+          <w:sz w:val="24"/>
         </w:rPr>
         <w:t>Figure: Source page 17: implementation-5.png</w:t>
       </w:r>
     </w:p>
     <w:p>
+      <w:pPr>
+        <w:spacing w:line="360" w:lineRule="auto"/>
+      </w:pPr>
       <w:r>
+        <w:rPr>
+          <w:rFonts w:ascii="Times New Roman" w:hAnsi="Times New Roman" w:eastAsia="Times New Roman"/>
+          <w:sz w:val="24"/>
+        </w:rPr>
         <w:drawing>
           <wp:inline xmlns:a="http://schemas.openxmlformats.org/drawingml/2006/main" xmlns:pic="http://schemas.openxmlformats.org/drawingml/2006/picture">
             <wp:extent cx="5669280" cy="7336715"/>
@@ -1697,7 +2807,7 @@
               <a:graphicData uri="http://schemas.openxmlformats.org/drawingml/2006/picture">
                 <pic:pic>
                   <pic:nvPicPr>
-                    <pic:cNvPr id="0" name="implementation-6.png"/>
+                    <pic:cNvPr id="18" name="implementation-6.png"/>
                     <pic:cNvPicPr/>
                   </pic:nvPicPr>
                   <pic:blipFill>
@@ -1721,15 +2831,27 @@
       </w:r>
     </w:p>
     <w:p>
+      <w:pPr>
+        <w:spacing w:line="360" w:lineRule="auto"/>
+      </w:pPr>
       <w:r>
         <w:rPr>
+          <w:rFonts w:ascii="Times New Roman" w:hAnsi="Times New Roman" w:eastAsia="Times New Roman"/>
           <w:i/>
+          <w:sz w:val="24"/>
         </w:rPr>
         <w:t>Figure: Source page 18: implementation-6.png</w:t>
       </w:r>
     </w:p>
     <w:p>
+      <w:pPr>
+        <w:spacing w:line="360" w:lineRule="auto"/>
+      </w:pPr>
       <w:r>
+        <w:rPr>
+          <w:rFonts w:ascii="Times New Roman" w:hAnsi="Times New Roman" w:eastAsia="Times New Roman"/>
+          <w:sz w:val="24"/>
+        </w:rPr>
         <w:drawing>
           <wp:inline xmlns:a="http://schemas.openxmlformats.org/drawingml/2006/main" xmlns:pic="http://schemas.openxmlformats.org/drawingml/2006/picture">
             <wp:extent cx="5669280" cy="7336715"/>
@@ -1741,7 +2863,7 @@
               <a:graphicData uri="http://schemas.openxmlformats.org/drawingml/2006/picture">
                 <pic:pic>
                   <pic:nvPicPr>
-                    <pic:cNvPr id="0" name="implementation-7.png"/>
+                    <pic:cNvPr id="19" name="implementation-7.png"/>
                     <pic:cNvPicPr/>
                   </pic:nvPicPr>
                   <pic:blipFill>
@@ -1765,142 +2887,734 @@
       </w:r>
     </w:p>
     <w:p>
+      <w:pPr>
+        <w:spacing w:line="360" w:lineRule="auto"/>
+      </w:pPr>
       <w:r>
         <w:rPr>
+          <w:rFonts w:ascii="Times New Roman" w:hAnsi="Times New Roman" w:eastAsia="Times New Roman"/>
           <w:i/>
+          <w:sz w:val="24"/>
         </w:rPr>
         <w:t>Figure: Source page 19: implementation-7.png</w:t>
       </w:r>
     </w:p>
     <w:p>
+      <w:pPr>
+        <w:spacing w:line="360" w:lineRule="auto"/>
+      </w:pPr>
       <w:r>
+        <w:rPr>
+          <w:rFonts w:ascii="Times New Roman" w:hAnsi="Times New Roman" w:eastAsia="Times New Roman"/>
+          <w:sz w:val="24"/>
+        </w:rPr>
         <w:br w:type="page"/>
       </w:r>
     </w:p>
     <w:p>
       <w:pPr>
         <w:pStyle w:val="Heading1"/>
+        <w:spacing w:line="360" w:lineRule="auto"/>
       </w:pPr>
       <w:r>
+        <w:rPr>
+          <w:rFonts w:ascii="Times New Roman" w:hAnsi="Times New Roman" w:eastAsia="Times New Roman"/>
+          <w:sz w:val="24"/>
+        </w:rPr>
         <w:t>Appendix B: Endpoint Catalogue by Domain</w:t>
       </w:r>
     </w:p>
     <w:p>
+      <w:pPr>
+        <w:spacing w:line="360" w:lineRule="auto"/>
+      </w:pPr>
       <w:r>
+        <w:rPr>
+          <w:rFonts w:ascii="Times New Roman" w:hAnsi="Times New Roman" w:eastAsia="Times New Roman"/>
+          <w:sz w:val="24"/>
+        </w:rPr>
         <w:t>Authentication: /auth/signup, /auth/login, /auth/me, /auth/logout</w:t>
       </w:r>
     </w:p>
     <w:p>
+      <w:pPr>
+        <w:spacing w:line="360" w:lineRule="auto"/>
+      </w:pPr>
       <w:r>
+        <w:rPr>
+          <w:rFonts w:ascii="Times New Roman" w:hAnsi="Times New Roman" w:eastAsia="Times New Roman"/>
+          <w:sz w:val="24"/>
+        </w:rPr>
         <w:t>Users: /users/me, /users/me (PATCH), /users, /users/:id</w:t>
       </w:r>
     </w:p>
     <w:p>
+      <w:pPr>
+        <w:spacing w:line="360" w:lineRule="auto"/>
+      </w:pPr>
       <w:r>
+        <w:rPr>
+          <w:rFonts w:ascii="Times New Roman" w:hAnsi="Times New Roman" w:eastAsia="Times New Roman"/>
+          <w:sz w:val="24"/>
+        </w:rPr>
         <w:t>Parents: /parents/me, /parents/me/students/search, /parents/me/students/:studentId</w:t>
       </w:r>
     </w:p>
     <w:p>
+      <w:pPr>
+        <w:spacing w:line="360" w:lineRule="auto"/>
+      </w:pPr>
       <w:r>
+        <w:rPr>
+          <w:rFonts w:ascii="Times New Roman" w:hAnsi="Times New Roman" w:eastAsia="Times New Roman"/>
+          <w:sz w:val="24"/>
+        </w:rPr>
         <w:t>Students: /students CRUD set</w:t>
       </w:r>
     </w:p>
     <w:p>
+      <w:pPr>
+        <w:spacing w:line="360" w:lineRule="auto"/>
+      </w:pPr>
       <w:r>
+        <w:rPr>
+          <w:rFonts w:ascii="Times New Roman" w:hAnsi="Times New Roman" w:eastAsia="Times New Roman"/>
+          <w:sz w:val="24"/>
+        </w:rPr>
         <w:t>Buses: /buses CRUD set, /buses/:id/students</w:t>
       </w:r>
     </w:p>
     <w:p>
+      <w:pPr>
+        <w:spacing w:line="360" w:lineRule="auto"/>
+      </w:pPr>
       <w:r>
+        <w:rPr>
+          <w:rFonts w:ascii="Times New Roman" w:hAnsi="Times New Roman" w:eastAsia="Times New Roman"/>
+          <w:sz w:val="24"/>
+        </w:rPr>
         <w:t>Trips: /trips CRUD set, /driver/trips/:tripId/start|end|location|progress</w:t>
       </w:r>
     </w:p>
     <w:p>
+      <w:pPr>
+        <w:spacing w:line="360" w:lineRule="auto"/>
+      </w:pPr>
       <w:r>
+        <w:rPr>
+          <w:rFonts w:ascii="Times New Roman" w:hAnsi="Times New Roman" w:eastAsia="Times New Roman"/>
+          <w:sz w:val="24"/>
+        </w:rPr>
         <w:t>Tracking: /parent/tracking/trips/:tripId, websocket namespace /tracking</w:t>
       </w:r>
     </w:p>
     <w:p>
+      <w:pPr>
+        <w:spacing w:line="360" w:lineRule="auto"/>
+      </w:pPr>
       <w:r>
+        <w:rPr>
+          <w:rFonts w:ascii="Times New Roman" w:hAnsi="Times New Roman" w:eastAsia="Times New Roman"/>
+          <w:sz w:val="24"/>
+        </w:rPr>
         <w:t>Attendance: /attendance, /attendance/trip/:tripId, /attendance/student/:studentId</w:t>
       </w:r>
     </w:p>
     <w:p>
+      <w:pPr>
+        <w:spacing w:line="360" w:lineRule="auto"/>
+      </w:pPr>
       <w:r>
+        <w:rPr>
+          <w:rFonts w:ascii="Times New Roman" w:hAnsi="Times New Roman" w:eastAsia="Times New Roman"/>
+          <w:sz w:val="24"/>
+        </w:rPr>
         <w:t>Notifications: /notifications, /notifications/unread-count, /notifications/:id/read</w:t>
       </w:r>
     </w:p>
     <w:p>
+      <w:pPr>
+        <w:spacing w:line="360" w:lineRule="auto"/>
+      </w:pPr>
       <w:r>
+        <w:rPr>
+          <w:rFonts w:ascii="Times New Roman" w:hAnsi="Times New Roman" w:eastAsia="Times New Roman"/>
+          <w:sz w:val="24"/>
+        </w:rPr>
         <w:t>Dashboard: /dashboard/admin, /dashboard/driver, /dashboard/parent</w:t>
       </w:r>
     </w:p>
     <w:p>
+      <w:pPr>
+        <w:spacing w:line="360" w:lineRule="auto"/>
+      </w:pPr>
       <w:r>
+        <w:rPr>
+          <w:rFonts w:ascii="Times New Roman" w:hAnsi="Times New Roman" w:eastAsia="Times New Roman"/>
+          <w:sz w:val="24"/>
+        </w:rPr>
         <w:t>CSV import: /csv-import/students/preview, /csv-import/students/commit</w:t>
       </w:r>
     </w:p>
     <w:p>
+      <w:pPr>
+        <w:spacing w:line="360" w:lineRule="auto"/>
+      </w:pPr>
       <w:r>
+        <w:rPr>
+          <w:rFonts w:ascii="Times New Roman" w:hAnsi="Times New Roman" w:eastAsia="Times New Roman"/>
+          <w:sz w:val="24"/>
+        </w:rPr>
         <w:t>Routes: /routes</w:t>
       </w:r>
     </w:p>
     <w:p>
+      <w:pPr>
+        <w:spacing w:line="360" w:lineRule="auto"/>
+      </w:pPr>
       <w:r>
+        <w:rPr>
+          <w:rFonts w:ascii="Times New Roman" w:hAnsi="Times New Roman" w:eastAsia="Times New Roman"/>
+          <w:sz w:val="24"/>
+        </w:rPr>
         <w:br w:type="page"/>
       </w:r>
     </w:p>
     <w:p>
       <w:pPr>
         <w:pStyle w:val="Heading1"/>
+        <w:spacing w:line="360" w:lineRule="auto"/>
       </w:pPr>
       <w:r>
+        <w:rPr>
+          <w:rFonts w:ascii="Times New Roman" w:hAnsi="Times New Roman" w:eastAsia="Times New Roman"/>
+          <w:sz w:val="24"/>
+        </w:rPr>
         <w:t>Appendix C: Data Dictionary (Condensed)</w:t>
       </w:r>
     </w:p>
     <w:p>
+      <w:pPr>
+        <w:spacing w:line="360" w:lineRule="auto"/>
+      </w:pPr>
       <w:r>
+        <w:rPr>
+          <w:rFonts w:ascii="Times New Roman" w:hAnsi="Times New Roman" w:eastAsia="Times New Roman"/>
+          <w:sz w:val="24"/>
+        </w:rPr>
         <w:t>User: identity, role, hashed password, profile fields.</w:t>
       </w:r>
     </w:p>
     <w:p>
+      <w:pPr>
+        <w:spacing w:line="360" w:lineRule="auto"/>
+      </w:pPr>
       <w:r>
+        <w:rPr>
+          <w:rFonts w:ascii="Times New Roman" w:hAnsi="Times New Roman" w:eastAsia="Times New Roman"/>
+          <w:sz w:val="24"/>
+        </w:rPr>
         <w:t>Session: bearer token, expiry, user relationship.</w:t>
       </w:r>
     </w:p>
     <w:p>
+      <w:pPr>
+        <w:spacing w:line="360" w:lineRule="auto"/>
+      </w:pPr>
       <w:r>
+        <w:rPr>
+          <w:rFonts w:ascii="Times New Roman" w:hAnsi="Times New Roman" w:eastAsia="Times New Roman"/>
+          <w:sz w:val="24"/>
+        </w:rPr>
         <w:t>Parent/Driver: role extensions attached to user.</w:t>
       </w:r>
     </w:p>
     <w:p>
+      <w:pPr>
+        <w:spacing w:line="360" w:lineRule="auto"/>
+      </w:pPr>
       <w:r>
+        <w:rPr>
+          <w:rFonts w:ascii="Times New Roman" w:hAnsi="Times New Roman" w:eastAsia="Times New Roman"/>
+          <w:sz w:val="24"/>
+        </w:rPr>
         <w:t>Student: transport and guardian-related profile attributes.</w:t>
       </w:r>
     </w:p>
     <w:p>
+      <w:pPr>
+        <w:spacing w:line="360" w:lineRule="auto"/>
+      </w:pPr>
       <w:r>
+        <w:rPr>
+          <w:rFonts w:ascii="Times New Roman" w:hAnsi="Times New Roman" w:eastAsia="Times New Roman"/>
+          <w:sz w:val="24"/>
+        </w:rPr>
         <w:t>Bus: vehicle identity and route assignment fields.</w:t>
       </w:r>
     </w:p>
     <w:p>
+      <w:pPr>
+        <w:spacing w:line="360" w:lineRule="auto"/>
+      </w:pPr>
       <w:r>
+        <w:rPr>
+          <w:rFonts w:ascii="Times New Roman" w:hAnsi="Times New Roman" w:eastAsia="Times New Roman"/>
+          <w:sz w:val="24"/>
+        </w:rPr>
         <w:t>Trip: operational lifecycle, timing, stop and ETA metadata.</w:t>
       </w:r>
     </w:p>
     <w:p>
+      <w:pPr>
+        <w:spacing w:line="360" w:lineRule="auto"/>
+      </w:pPr>
       <w:r>
+        <w:rPr>
+          <w:rFonts w:ascii="Times New Roman" w:hAnsi="Times New Roman" w:eastAsia="Times New Roman"/>
+          <w:sz w:val="24"/>
+        </w:rPr>
         <w:t>TripLocation: timestamped geolocation point per trip.</w:t>
       </w:r>
     </w:p>
     <w:p>
+      <w:pPr>
+        <w:spacing w:line="360" w:lineRule="auto"/>
+      </w:pPr>
       <w:r>
+        <w:rPr>
+          <w:rFonts w:ascii="Times New Roman" w:hAnsi="Times New Roman" w:eastAsia="Times New Roman"/>
+          <w:sz w:val="24"/>
+        </w:rPr>
         <w:t>Attendance: student-trip status record with marked metadata.</w:t>
       </w:r>
     </w:p>
     <w:p>
+      <w:pPr>
+        <w:spacing w:line="360" w:lineRule="auto"/>
+      </w:pPr>
       <w:r>
+        <w:rPr>
+          <w:rFonts w:ascii="Times New Roman" w:hAnsi="Times New Roman" w:eastAsia="Times New Roman"/>
+          <w:sz w:val="24"/>
+        </w:rPr>
         <w:t>Notification: title/body with optional role or student targeting.</w:t>
+      </w:r>
+    </w:p>
+    <w:p>
+      <w:pPr>
+        <w:spacing w:line="360" w:lineRule="auto"/>
+      </w:pPr>
+      <w:r>
+        <w:rPr>
+          <w:rFonts w:ascii="Times New Roman" w:hAnsi="Times New Roman" w:eastAsia="Times New Roman"/>
+          <w:sz w:val="24"/>
+        </w:rPr>
+        <w:br w:type="page"/>
+      </w:r>
+    </w:p>
+    <w:p>
+      <w:pPr>
+        <w:pStyle w:val="Heading1"/>
+        <w:spacing w:line="360" w:lineRule="auto"/>
+      </w:pPr>
+      <w:r>
+        <w:rPr>
+          <w:rFonts w:ascii="Times New Roman" w:hAnsi="Times New Roman" w:eastAsia="Times New Roman"/>
+          <w:sz w:val="24"/>
+        </w:rPr>
+        <w:t>Appendix A: Complete API Surface (Operational Summary)</w:t>
+      </w:r>
+    </w:p>
+    <w:p>
+      <w:pPr>
+        <w:spacing w:line="360" w:lineRule="auto"/>
+      </w:pPr>
+      <w:r>
+        <w:rPr>
+          <w:rFonts w:ascii="Times New Roman" w:hAnsi="Times New Roman" w:eastAsia="Times New Roman"/>
+          <w:sz w:val="24"/>
+        </w:rPr>
+        <w:t>This appendix summarizes the live endpoints used by the mobile application in production workflows. It acts as a contract reference for frontend, backend, and QA validation before release.</w:t>
+      </w:r>
+    </w:p>
+    <w:p>
+      <w:pPr>
+        <w:pStyle w:val="ListBullet"/>
+        <w:spacing w:line="360" w:lineRule="auto"/>
+      </w:pPr>
+      <w:r>
+        <w:rPr>
+          <w:rFonts w:ascii="Times New Roman" w:hAnsi="Times New Roman" w:eastAsia="Times New Roman"/>
+          <w:sz w:val="24"/>
+        </w:rPr>
+        <w:t>Authentication: /api/auth/signup, /api/auth/login, /api/auth/me, /api/auth/logout</w:t>
+      </w:r>
+    </w:p>
+    <w:p>
+      <w:pPr>
+        <w:pStyle w:val="ListBullet"/>
+        <w:spacing w:line="360" w:lineRule="auto"/>
+      </w:pPr>
+      <w:r>
+        <w:rPr>
+          <w:rFonts w:ascii="Times New Roman" w:hAnsi="Times New Roman" w:eastAsia="Times New Roman"/>
+          <w:sz w:val="24"/>
+        </w:rPr>
+        <w:t>Dashboards: /api/dashboard/parent, /api/dashboard/driver, /api/dashboard/admin</w:t>
+      </w:r>
+    </w:p>
+    <w:p>
+      <w:pPr>
+        <w:pStyle w:val="ListBullet"/>
+        <w:spacing w:line="360" w:lineRule="auto"/>
+      </w:pPr>
+      <w:r>
+        <w:rPr>
+          <w:rFonts w:ascii="Times New Roman" w:hAnsi="Times New Roman" w:eastAsia="Times New Roman"/>
+          <w:sz w:val="24"/>
+        </w:rPr>
+        <w:t>Trips and live ops: /api/trips, /api/driver/trips/:tripId/start, /api/driver/trips/:tripId/location, /api/driver/trips/:tripId/live</w:t>
+      </w:r>
+    </w:p>
+    <w:p>
+      <w:pPr>
+        <w:pStyle w:val="ListBullet"/>
+        <w:spacing w:line="360" w:lineRule="auto"/>
+      </w:pPr>
+      <w:r>
+        <w:rPr>
+          <w:rFonts w:ascii="Times New Roman" w:hAnsi="Times New Roman" w:eastAsia="Times New Roman"/>
+          <w:sz w:val="24"/>
+        </w:rPr>
+        <w:t>Parent tracking: /api/parent/tracking/trips/:tripId</w:t>
+      </w:r>
+    </w:p>
+    <w:p>
+      <w:pPr>
+        <w:pStyle w:val="ListBullet"/>
+        <w:spacing w:line="360" w:lineRule="auto"/>
+      </w:pPr>
+      <w:r>
+        <w:rPr>
+          <w:rFonts w:ascii="Times New Roman" w:hAnsi="Times New Roman" w:eastAsia="Times New Roman"/>
+          <w:sz w:val="24"/>
+        </w:rPr>
+        <w:t>Buses and roster: /api/buses, /api/buses/:id/students</w:t>
+      </w:r>
+    </w:p>
+    <w:p>
+      <w:pPr>
+        <w:pStyle w:val="ListBullet"/>
+        <w:spacing w:line="360" w:lineRule="auto"/>
+      </w:pPr>
+      <w:r>
+        <w:rPr>
+          <w:rFonts w:ascii="Times New Roman" w:hAnsi="Times New Roman" w:eastAsia="Times New Roman"/>
+          <w:sz w:val="24"/>
+        </w:rPr>
+        <w:t>Notifications: /api/notifications, /api/notifications/:id/read, /api/notifications/unread-count, /api/notifications/emergency</w:t>
+      </w:r>
+    </w:p>
+    <w:p>
+      <w:pPr>
+        <w:pStyle w:val="ListBullet"/>
+        <w:spacing w:line="360" w:lineRule="auto"/>
+      </w:pPr>
+      <w:r>
+        <w:rPr>
+          <w:rFonts w:ascii="Times New Roman" w:hAnsi="Times New Roman" w:eastAsia="Times New Roman"/>
+          <w:sz w:val="24"/>
+        </w:rPr>
+        <w:t>Onboarding: /api/onboarding/parent and /api/onboarding/driver</w:t>
+      </w:r>
+    </w:p>
+    <w:p>
+      <w:pPr>
+        <w:pStyle w:val="Heading1"/>
+        <w:spacing w:line="360" w:lineRule="auto"/>
+      </w:pPr>
+      <w:r>
+        <w:rPr>
+          <w:rFonts w:ascii="Times New Roman" w:hAnsi="Times New Roman" w:eastAsia="Times New Roman"/>
+          <w:sz w:val="24"/>
+        </w:rPr>
+        <w:t>Appendix B: Data Model and Relationship Notes</w:t>
+      </w:r>
+    </w:p>
+    <w:p>
+      <w:pPr>
+        <w:spacing w:line="360" w:lineRule="auto"/>
+      </w:pPr>
+      <w:r>
+        <w:rPr>
+          <w:rFonts w:ascii="Times New Roman" w:hAnsi="Times New Roman" w:eastAsia="Times New Roman"/>
+          <w:sz w:val="24"/>
+        </w:rPr>
+        <w:t>The database model is centered on User identities and role profiles. Role-linked rows and cross-entity joins provide the data used by each dashboard and live tracking screen.</w:t>
+      </w:r>
+    </w:p>
+    <w:p>
+      <w:pPr>
+        <w:pStyle w:val="ListBullet"/>
+        <w:spacing w:line="360" w:lineRule="auto"/>
+      </w:pPr>
+      <w:r>
+        <w:rPr>
+          <w:rFonts w:ascii="Times New Roman" w:hAnsi="Times New Roman" w:eastAsia="Times New Roman"/>
+          <w:sz w:val="24"/>
+        </w:rPr>
+        <w:t>User -&gt; Parent and User -&gt; Driver role profile linkage.</w:t>
+      </w:r>
+    </w:p>
+    <w:p>
+      <w:pPr>
+        <w:pStyle w:val="ListBullet"/>
+        <w:spacing w:line="360" w:lineRule="auto"/>
+      </w:pPr>
+      <w:r>
+        <w:rPr>
+          <w:rFonts w:ascii="Times New Roman" w:hAnsi="Times New Roman" w:eastAsia="Times New Roman"/>
+          <w:sz w:val="24"/>
+        </w:rPr>
+        <w:t>Parent -&gt; Student (one-to-many), supporting multiple children per parent account.</w:t>
+      </w:r>
+    </w:p>
+    <w:p>
+      <w:pPr>
+        <w:pStyle w:val="ListBullet"/>
+        <w:spacing w:line="360" w:lineRule="auto"/>
+      </w:pPr>
+      <w:r>
+        <w:rPr>
+          <w:rFonts w:ascii="Times New Roman" w:hAnsi="Times New Roman" w:eastAsia="Times New Roman"/>
+          <w:sz w:val="24"/>
+        </w:rPr>
+        <w:t>Bus -&gt; Trip and Driver -&gt; Trip operational assignments.</w:t>
+      </w:r>
+    </w:p>
+    <w:p>
+      <w:pPr>
+        <w:pStyle w:val="ListBullet"/>
+        <w:spacing w:line="360" w:lineRule="auto"/>
+      </w:pPr>
+      <w:r>
+        <w:rPr>
+          <w:rFonts w:ascii="Times New Roman" w:hAnsi="Times New Roman" w:eastAsia="Times New Roman"/>
+          <w:sz w:val="24"/>
+        </w:rPr>
+        <w:t>Trip -&gt; Attendance for student status lifecycle.</w:t>
+      </w:r>
+    </w:p>
+    <w:p>
+      <w:pPr>
+        <w:pStyle w:val="ListBullet"/>
+        <w:spacing w:line="360" w:lineRule="auto"/>
+      </w:pPr>
+      <w:r>
+        <w:rPr>
+          <w:rFonts w:ascii="Times New Roman" w:hAnsi="Times New Roman" w:eastAsia="Times New Roman"/>
+          <w:sz w:val="24"/>
+        </w:rPr>
+        <w:t>Trip -&gt; Location history for route map and fleet map live positioning.</w:t>
+      </w:r>
+    </w:p>
+    <w:p>
+      <w:pPr>
+        <w:pStyle w:val="ListBullet"/>
+        <w:spacing w:line="360" w:lineRule="auto"/>
+      </w:pPr>
+      <w:r>
+        <w:rPr>
+          <w:rFonts w:ascii="Times New Roman" w:hAnsi="Times New Roman" w:eastAsia="Times New Roman"/>
+          <w:sz w:val="24"/>
+        </w:rPr>
+        <w:t>Notification targeting by role and optional student context.</w:t>
+      </w:r>
+    </w:p>
+    <w:p>
+      <w:pPr>
+        <w:pStyle w:val="Heading1"/>
+        <w:spacing w:line="360" w:lineRule="auto"/>
+      </w:pPr>
+      <w:r>
+        <w:rPr>
+          <w:rFonts w:ascii="Times New Roman" w:hAnsi="Times New Roman" w:eastAsia="Times New Roman"/>
+          <w:sz w:val="24"/>
+        </w:rPr>
+        <w:t>Appendix C: Release Runbook and Verification</w:t>
+      </w:r>
+    </w:p>
+    <w:p>
+      <w:pPr>
+        <w:pStyle w:val="ListNumber"/>
+        <w:numPr>
+          <w:ilvl w:val="0"/>
+          <w:numId w:val="10"/>
+        </w:numPr>
+        <w:spacing w:line="360" w:lineRule="auto"/>
+      </w:pPr>
+      <w:r>
+        <w:rPr>
+          <w:rFonts w:ascii="Times New Roman" w:hAnsi="Times New Roman" w:eastAsia="Times New Roman"/>
+          <w:sz w:val="24"/>
+        </w:rPr>
+        <w:t>Run backend compile check: npm run build.</w:t>
+      </w:r>
+    </w:p>
+    <w:p>
+      <w:pPr>
+        <w:pStyle w:val="ListNumber"/>
+        <w:spacing w:line="360" w:lineRule="auto"/>
+      </w:pPr>
+      <w:r>
+        <w:rPr>
+          <w:rFonts w:ascii="Times New Roman" w:hAnsi="Times New Roman" w:eastAsia="Times New Roman"/>
+          <w:sz w:val="24"/>
+        </w:rPr>
+        <w:t>Run full backend e2e suite against the target database.</w:t>
+      </w:r>
+    </w:p>
+    <w:p>
+      <w:pPr>
+        <w:pStyle w:val="ListNumber"/>
+        <w:spacing w:line="360" w:lineRule="auto"/>
+      </w:pPr>
+      <w:r>
+        <w:rPr>
+          <w:rFonts w:ascii="Times New Roman" w:hAnsi="Times New Roman" w:eastAsia="Times New Roman"/>
+          <w:sz w:val="24"/>
+        </w:rPr>
+        <w:t>Run frontend-backend contract e2e suite for core mobile API contracts.</w:t>
+      </w:r>
+    </w:p>
+    <w:p>
+      <w:pPr>
+        <w:pStyle w:val="ListNumber"/>
+        <w:spacing w:line="360" w:lineRule="auto"/>
+      </w:pPr>
+      <w:r>
+        <w:rPr>
+          <w:rFonts w:ascii="Times New Roman" w:hAnsi="Times New Roman" w:eastAsia="Times New Roman"/>
+          <w:sz w:val="24"/>
+        </w:rPr>
+        <w:t>Verify deployment environment variables and secrets.</w:t>
+      </w:r>
+    </w:p>
+    <w:p>
+      <w:pPr>
+        <w:pStyle w:val="ListNumber"/>
+        <w:spacing w:line="360" w:lineRule="auto"/>
+      </w:pPr>
+      <w:r>
+        <w:rPr>
+          <w:rFonts w:ascii="Times New Roman" w:hAnsi="Times New Roman" w:eastAsia="Times New Roman"/>
+          <w:sz w:val="24"/>
+        </w:rPr>
+        <w:t>Apply migrations safely in pipeline.</w:t>
+      </w:r>
+    </w:p>
+    <w:p>
+      <w:pPr>
+        <w:pStyle w:val="ListNumber"/>
+        <w:spacing w:line="360" w:lineRule="auto"/>
+      </w:pPr>
+      <w:r>
+        <w:rPr>
+          <w:rFonts w:ascii="Times New Roman" w:hAnsi="Times New Roman" w:eastAsia="Times New Roman"/>
+          <w:sz w:val="24"/>
+        </w:rPr>
+        <w:t>Execute post-deploy smoke flow for parent, driver, and admin journeys.</w:t>
+      </w:r>
+    </w:p>
+    <w:p>
+      <w:pPr>
+        <w:pStyle w:val="Heading1"/>
+        <w:spacing w:line="360" w:lineRule="auto"/>
+      </w:pPr>
+      <w:r>
+        <w:rPr>
+          <w:rFonts w:ascii="Times New Roman" w:hAnsi="Times New Roman" w:eastAsia="Times New Roman"/>
+          <w:sz w:val="24"/>
+        </w:rPr>
+        <w:t>Appendix D: Test Evidence and Contract Coverage</w:t>
+      </w:r>
+    </w:p>
+    <w:p>
+      <w:pPr>
+        <w:spacing w:line="360" w:lineRule="auto"/>
+      </w:pPr>
+      <w:r>
+        <w:rPr>
+          <w:rFonts w:ascii="Times New Roman" w:hAnsi="Times New Roman" w:eastAsia="Times New Roman"/>
+          <w:sz w:val="24"/>
+        </w:rPr>
+        <w:t>Contract tests validate payload shape compatibility with Flutter parsing models and services, including auth, dashboards, live tracking, notifications, and emergency reporting pathways.</w:t>
+      </w:r>
+    </w:p>
+    <w:p>
+      <w:pPr>
+        <w:pStyle w:val="ListBullet"/>
+        <w:spacing w:line="360" w:lineRule="auto"/>
+      </w:pPr>
+      <w:r>
+        <w:rPr>
+          <w:rFonts w:ascii="Times New Roman" w:hAnsi="Times New Roman" w:eastAsia="Times New Roman"/>
+          <w:sz w:val="24"/>
+        </w:rPr>
+        <w:t>Auth /me payload aligns with UserModel mapping requirements.</w:t>
+      </w:r>
+    </w:p>
+    <w:p>
+      <w:pPr>
+        <w:pStyle w:val="ListBullet"/>
+        <w:spacing w:line="360" w:lineRule="auto"/>
+      </w:pPr>
+      <w:r>
+        <w:rPr>
+          <w:rFonts w:ascii="Times New Roman" w:hAnsi="Times New Roman" w:eastAsia="Times New Roman"/>
+          <w:sz w:val="24"/>
+        </w:rPr>
+        <w:t>Parent dashboard payload includes child and active trip structures expected by provider/services.</w:t>
+      </w:r>
+    </w:p>
+    <w:p>
+      <w:pPr>
+        <w:pStyle w:val="ListBullet"/>
+        <w:spacing w:line="360" w:lineRule="auto"/>
+      </w:pPr>
+      <w:r>
+        <w:rPr>
+          <w:rFonts w:ascii="Times New Roman" w:hAnsi="Times New Roman" w:eastAsia="Times New Roman"/>
+          <w:sz w:val="24"/>
+        </w:rPr>
+        <w:t>Driver dashboard payload includes trip, bus, and attendance structures expected by UI state logic.</w:t>
+      </w:r>
+    </w:p>
+    <w:p>
+      <w:pPr>
+        <w:pStyle w:val="ListBullet"/>
+        <w:spacing w:line="360" w:lineRule="auto"/>
+      </w:pPr>
+      <w:r>
+        <w:rPr>
+          <w:rFonts w:ascii="Times New Roman" w:hAnsi="Times New Roman" w:eastAsia="Times New Roman"/>
+          <w:sz w:val="24"/>
+        </w:rPr>
+        <w:t>Admin dashboard payload includes counts, metrics, and in-progress trip data used by maps and cards.</w:t>
+      </w:r>
+    </w:p>
+    <w:p>
+      <w:pPr>
+        <w:pStyle w:val="ListBullet"/>
+        <w:spacing w:line="360" w:lineRule="auto"/>
+      </w:pPr>
+      <w:r>
+        <w:rPr>
+          <w:rFonts w:ascii="Times New Roman" w:hAnsi="Times New Roman" w:eastAsia="Times New Roman"/>
+          <w:sz w:val="24"/>
+        </w:rPr>
+        <w:t>Notification and emergency payloads align with frontend service contracts.</w:t>
       </w:r>
     </w:p>
     <w:sectPr>
@@ -2109,6 +3823,12 @@
   </w:num>
   <w:num w:numId="8">
     <w:abstractNumId w:val="1"/>
+  </w:num>
+  <w:num w:numId="10">
+    <w:abstractNumId w:val="7"/>
+    <w:lvlOverride w:ilvl="0">
+      <w:startOverride w:val="1"/>
+    </w:lvlOverride>
   </w:num>
   <w:num w:numId="9">
     <w:abstractNumId w:val="0"/>
@@ -2277,8 +3997,8 @@
     <w:qFormat/>
     <w:rsid w:val="00FC693F"/>
     <w:rPr>
-      <w:rFonts w:ascii="Calibri" w:hAnsi="Calibri"/>
-      <w:sz w:val="22"/>
+      <w:rFonts w:ascii="Times New Roman" w:hAnsi="Times New Roman" w:eastAsia="Times New Roman"/>
+      <w:sz w:val="24"/>
     </w:rPr>
   </w:style>
   <w:style w:type="paragraph" w:styleId="Header">

</xml_diff>